<commit_message>
Revisión: workflow con Python 3.14, dependencias actualizadas, README y lista de verificación
</commit_message>
<xml_diff>
--- a/docs/Proyecto_de_Aula_LF_Final.docx
+++ b/docs/Proyecto_de_Aula_LF_Final.docx
@@ -111,12 +111,6 @@
         <w:gridCol w:w="6160"/>
       </w:tblGrid>
       <w:tr>
-        <w:tblPrEx>
-          <w:tblCellMar>
-            <w:top w:w="0" w:type="dxa"/>
-            <w:bottom w:w="0" w:type="dxa"/>
-          </w:tblCellMar>
-        </w:tblPrEx>
         <w:tc>
           <w:tcPr>
             <w:tcW w:w="3200" w:type="dxa"/>
@@ -196,12 +190,6 @@
         </w:tc>
       </w:tr>
       <w:tr>
-        <w:tblPrEx>
-          <w:tblCellMar>
-            <w:top w:w="0" w:type="dxa"/>
-            <w:bottom w:w="0" w:type="dxa"/>
-          </w:tblCellMar>
-        </w:tblPrEx>
         <w:tc>
           <w:tcPr>
             <w:tcW w:w="3200" w:type="dxa"/>
@@ -265,12 +253,6 @@
         </w:tc>
       </w:tr>
       <w:tr>
-        <w:tblPrEx>
-          <w:tblCellMar>
-            <w:top w:w="0" w:type="dxa"/>
-            <w:bottom w:w="0" w:type="dxa"/>
-          </w:tblCellMar>
-        </w:tblPrEx>
         <w:tc>
           <w:tcPr>
             <w:tcW w:w="3200" w:type="dxa"/>
@@ -334,12 +316,6 @@
         </w:tc>
       </w:tr>
       <w:tr>
-        <w:tblPrEx>
-          <w:tblCellMar>
-            <w:top w:w="0" w:type="dxa"/>
-            <w:bottom w:w="0" w:type="dxa"/>
-          </w:tblCellMar>
-        </w:tblPrEx>
         <w:tc>
           <w:tcPr>
             <w:tcW w:w="3200" w:type="dxa"/>
@@ -412,12 +388,6 @@
         </w:tc>
       </w:tr>
       <w:tr>
-        <w:tblPrEx>
-          <w:tblCellMar>
-            <w:top w:w="0" w:type="dxa"/>
-            <w:bottom w:w="0" w:type="dxa"/>
-          </w:tblCellMar>
-        </w:tblPrEx>
         <w:tc>
           <w:tcPr>
             <w:tcW w:w="3200" w:type="dxa"/>
@@ -481,12 +451,6 @@
         </w:tc>
       </w:tr>
       <w:tr>
-        <w:tblPrEx>
-          <w:tblCellMar>
-            <w:top w:w="0" w:type="dxa"/>
-            <w:bottom w:w="0" w:type="dxa"/>
-          </w:tblCellMar>
-        </w:tblPrEx>
         <w:tc>
           <w:tcPr>
             <w:tcW w:w="3200" w:type="dxa"/>
@@ -550,12 +514,6 @@
         </w:tc>
       </w:tr>
       <w:tr>
-        <w:tblPrEx>
-          <w:tblCellMar>
-            <w:top w:w="0" w:type="dxa"/>
-            <w:bottom w:w="0" w:type="dxa"/>
-          </w:tblCellMar>
-        </w:tblPrEx>
         <w:tc>
           <w:tcPr>
             <w:tcW w:w="3200" w:type="dxa"/>
@@ -760,12 +718,6 @@
         <w:gridCol w:w="6160"/>
       </w:tblGrid>
       <w:tr>
-        <w:tblPrEx>
-          <w:tblCellMar>
-            <w:top w:w="0" w:type="dxa"/>
-            <w:bottom w:w="0" w:type="dxa"/>
-          </w:tblCellMar>
-        </w:tblPrEx>
         <w:tc>
           <w:tcPr>
             <w:tcW w:w="3200" w:type="dxa"/>
@@ -845,12 +797,6 @@
         </w:tc>
       </w:tr>
       <w:tr>
-        <w:tblPrEx>
-          <w:tblCellMar>
-            <w:top w:w="0" w:type="dxa"/>
-            <w:bottom w:w="0" w:type="dxa"/>
-          </w:tblCellMar>
-        </w:tblPrEx>
         <w:tc>
           <w:tcPr>
             <w:tcW w:w="3200" w:type="dxa"/>
@@ -914,12 +860,6 @@
         </w:tc>
       </w:tr>
       <w:tr>
-        <w:tblPrEx>
-          <w:tblCellMar>
-            <w:top w:w="0" w:type="dxa"/>
-            <w:bottom w:w="0" w:type="dxa"/>
-          </w:tblCellMar>
-        </w:tblPrEx>
         <w:tc>
           <w:tcPr>
             <w:tcW w:w="3200" w:type="dxa"/>
@@ -983,12 +923,6 @@
         </w:tc>
       </w:tr>
       <w:tr>
-        <w:tblPrEx>
-          <w:tblCellMar>
-            <w:top w:w="0" w:type="dxa"/>
-            <w:bottom w:w="0" w:type="dxa"/>
-          </w:tblCellMar>
-        </w:tblPrEx>
         <w:tc>
           <w:tcPr>
             <w:tcW w:w="3200" w:type="dxa"/>
@@ -1052,12 +986,6 @@
         </w:tc>
       </w:tr>
       <w:tr>
-        <w:tblPrEx>
-          <w:tblCellMar>
-            <w:top w:w="0" w:type="dxa"/>
-            <w:bottom w:w="0" w:type="dxa"/>
-          </w:tblCellMar>
-        </w:tblPrEx>
         <w:tc>
           <w:tcPr>
             <w:tcW w:w="3200" w:type="dxa"/>
@@ -1153,12 +1081,6 @@
         </w:tc>
       </w:tr>
       <w:tr>
-        <w:tblPrEx>
-          <w:tblCellMar>
-            <w:top w:w="0" w:type="dxa"/>
-            <w:bottom w:w="0" w:type="dxa"/>
-          </w:tblCellMar>
-        </w:tblPrEx>
         <w:tc>
           <w:tcPr>
             <w:tcW w:w="3200" w:type="dxa"/>
@@ -2060,12 +1982,6 @@
         <w:gridCol w:w="1337"/>
       </w:tblGrid>
       <w:tr>
-        <w:tblPrEx>
-          <w:tblCellMar>
-            <w:top w:w="0" w:type="dxa"/>
-            <w:bottom w:w="0" w:type="dxa"/>
-          </w:tblCellMar>
-        </w:tblPrEx>
         <w:trPr>
           <w:tblHeader/>
         </w:trPr>
@@ -2199,12 +2115,6 @@
         </w:tc>
       </w:tr>
       <w:tr>
-        <w:tblPrEx>
-          <w:tblCellMar>
-            <w:top w:w="0" w:type="dxa"/>
-            <w:bottom w:w="0" w:type="dxa"/>
-          </w:tblCellMar>
-        </w:tblPrEx>
         <w:tc>
           <w:tcPr>
             <w:tcW w:w="2263" w:type="dxa"/>
@@ -2323,12 +2233,6 @@
         </w:tc>
       </w:tr>
       <w:tr>
-        <w:tblPrEx>
-          <w:tblCellMar>
-            <w:top w:w="0" w:type="dxa"/>
-            <w:bottom w:w="0" w:type="dxa"/>
-          </w:tblCellMar>
-        </w:tblPrEx>
         <w:tc>
           <w:tcPr>
             <w:tcW w:w="2263" w:type="dxa"/>
@@ -2447,12 +2351,6 @@
         </w:tc>
       </w:tr>
       <w:tr>
-        <w:tblPrEx>
-          <w:tblCellMar>
-            <w:top w:w="0" w:type="dxa"/>
-            <w:bottom w:w="0" w:type="dxa"/>
-          </w:tblCellMar>
-        </w:tblPrEx>
         <w:tc>
           <w:tcPr>
             <w:tcW w:w="2263" w:type="dxa"/>
@@ -2817,12 +2715,6 @@
         <w:gridCol w:w="1459"/>
       </w:tblGrid>
       <w:tr>
-        <w:tblPrEx>
-          <w:tblCellMar>
-            <w:top w:w="0" w:type="dxa"/>
-            <w:bottom w:w="0" w:type="dxa"/>
-          </w:tblCellMar>
-        </w:tblPrEx>
         <w:trPr>
           <w:tblHeader/>
         </w:trPr>
@@ -2988,12 +2880,6 @@
         </w:tc>
       </w:tr>
       <w:tr>
-        <w:tblPrEx>
-          <w:tblCellMar>
-            <w:top w:w="0" w:type="dxa"/>
-            <w:bottom w:w="0" w:type="dxa"/>
-          </w:tblCellMar>
-        </w:tblPrEx>
         <w:tc>
           <w:tcPr>
             <w:tcW w:w="755" w:type="dxa"/>
@@ -3141,12 +3027,6 @@
         </w:tc>
       </w:tr>
       <w:tr>
-        <w:tblPrEx>
-          <w:tblCellMar>
-            <w:top w:w="0" w:type="dxa"/>
-            <w:bottom w:w="0" w:type="dxa"/>
-          </w:tblCellMar>
-        </w:tblPrEx>
         <w:tc>
           <w:tcPr>
             <w:tcW w:w="755" w:type="dxa"/>
@@ -3294,12 +3174,6 @@
         </w:tc>
       </w:tr>
       <w:tr>
-        <w:tblPrEx>
-          <w:tblCellMar>
-            <w:top w:w="0" w:type="dxa"/>
-            <w:bottom w:w="0" w:type="dxa"/>
-          </w:tblCellMar>
-        </w:tblPrEx>
         <w:tc>
           <w:tcPr>
             <w:tcW w:w="755" w:type="dxa"/>
@@ -3447,12 +3321,6 @@
         </w:tc>
       </w:tr>
       <w:tr>
-        <w:tblPrEx>
-          <w:tblCellMar>
-            <w:top w:w="0" w:type="dxa"/>
-            <w:bottom w:w="0" w:type="dxa"/>
-          </w:tblCellMar>
-        </w:tblPrEx>
         <w:tc>
           <w:tcPr>
             <w:tcW w:w="755" w:type="dxa"/>
@@ -3600,12 +3468,6 @@
         </w:tc>
       </w:tr>
       <w:tr>
-        <w:tblPrEx>
-          <w:tblCellMar>
-            <w:top w:w="0" w:type="dxa"/>
-            <w:bottom w:w="0" w:type="dxa"/>
-          </w:tblCellMar>
-        </w:tblPrEx>
         <w:tc>
           <w:tcPr>
             <w:tcW w:w="755" w:type="dxa"/>
@@ -3753,12 +3615,6 @@
         </w:tc>
       </w:tr>
       <w:tr>
-        <w:tblPrEx>
-          <w:tblCellMar>
-            <w:top w:w="0" w:type="dxa"/>
-            <w:bottom w:w="0" w:type="dxa"/>
-          </w:tblCellMar>
-        </w:tblPrEx>
         <w:tc>
           <w:tcPr>
             <w:tcW w:w="755" w:type="dxa"/>
@@ -3906,12 +3762,6 @@
         </w:tc>
       </w:tr>
       <w:tr>
-        <w:tblPrEx>
-          <w:tblCellMar>
-            <w:top w:w="0" w:type="dxa"/>
-            <w:bottom w:w="0" w:type="dxa"/>
-          </w:tblCellMar>
-        </w:tblPrEx>
         <w:tc>
           <w:tcPr>
             <w:tcW w:w="755" w:type="dxa"/>
@@ -4059,12 +3909,6 @@
         </w:tc>
       </w:tr>
       <w:tr>
-        <w:tblPrEx>
-          <w:tblCellMar>
-            <w:top w:w="0" w:type="dxa"/>
-            <w:bottom w:w="0" w:type="dxa"/>
-          </w:tblCellMar>
-        </w:tblPrEx>
         <w:tc>
           <w:tcPr>
             <w:tcW w:w="755" w:type="dxa"/>
@@ -4212,12 +4056,6 @@
         </w:tc>
       </w:tr>
       <w:tr>
-        <w:tblPrEx>
-          <w:tblCellMar>
-            <w:top w:w="0" w:type="dxa"/>
-            <w:bottom w:w="0" w:type="dxa"/>
-          </w:tblCellMar>
-        </w:tblPrEx>
         <w:tc>
           <w:tcPr>
             <w:tcW w:w="755" w:type="dxa"/>
@@ -4365,12 +4203,6 @@
         </w:tc>
       </w:tr>
       <w:tr>
-        <w:tblPrEx>
-          <w:tblCellMar>
-            <w:top w:w="0" w:type="dxa"/>
-            <w:bottom w:w="0" w:type="dxa"/>
-          </w:tblCellMar>
-        </w:tblPrEx>
         <w:tc>
           <w:tcPr>
             <w:tcW w:w="755" w:type="dxa"/>
@@ -4518,12 +4350,6 @@
         </w:tc>
       </w:tr>
       <w:tr>
-        <w:tblPrEx>
-          <w:tblCellMar>
-            <w:top w:w="0" w:type="dxa"/>
-            <w:bottom w:w="0" w:type="dxa"/>
-          </w:tblCellMar>
-        </w:tblPrEx>
         <w:tc>
           <w:tcPr>
             <w:tcW w:w="755" w:type="dxa"/>
@@ -4671,12 +4497,6 @@
         </w:tc>
       </w:tr>
       <w:tr>
-        <w:tblPrEx>
-          <w:tblCellMar>
-            <w:top w:w="0" w:type="dxa"/>
-            <w:bottom w:w="0" w:type="dxa"/>
-          </w:tblCellMar>
-        </w:tblPrEx>
         <w:tc>
           <w:tcPr>
             <w:tcW w:w="755" w:type="dxa"/>
@@ -4824,12 +4644,6 @@
         </w:tc>
       </w:tr>
       <w:tr>
-        <w:tblPrEx>
-          <w:tblCellMar>
-            <w:top w:w="0" w:type="dxa"/>
-            <w:bottom w:w="0" w:type="dxa"/>
-          </w:tblCellMar>
-        </w:tblPrEx>
         <w:tc>
           <w:tcPr>
             <w:tcW w:w="755" w:type="dxa"/>
@@ -4977,12 +4791,6 @@
         </w:tc>
       </w:tr>
       <w:tr>
-        <w:tblPrEx>
-          <w:tblCellMar>
-            <w:top w:w="0" w:type="dxa"/>
-            <w:bottom w:w="0" w:type="dxa"/>
-          </w:tblCellMar>
-        </w:tblPrEx>
         <w:tc>
           <w:tcPr>
             <w:tcW w:w="755" w:type="dxa"/>
@@ -5130,12 +4938,6 @@
         </w:tc>
       </w:tr>
       <w:tr>
-        <w:tblPrEx>
-          <w:tblCellMar>
-            <w:top w:w="0" w:type="dxa"/>
-            <w:bottom w:w="0" w:type="dxa"/>
-          </w:tblCellMar>
-        </w:tblPrEx>
         <w:tc>
           <w:tcPr>
             <w:tcW w:w="755" w:type="dxa"/>
@@ -5284,12 +5086,6 @@
         </w:tc>
       </w:tr>
       <w:tr>
-        <w:tblPrEx>
-          <w:tblCellMar>
-            <w:top w:w="0" w:type="dxa"/>
-            <w:bottom w:w="0" w:type="dxa"/>
-          </w:tblCellMar>
-        </w:tblPrEx>
         <w:tc>
           <w:tcPr>
             <w:tcW w:w="755" w:type="dxa"/>
@@ -5437,12 +5233,6 @@
         </w:tc>
       </w:tr>
       <w:tr>
-        <w:tblPrEx>
-          <w:tblCellMar>
-            <w:top w:w="0" w:type="dxa"/>
-            <w:bottom w:w="0" w:type="dxa"/>
-          </w:tblCellMar>
-        </w:tblPrEx>
         <w:tc>
           <w:tcPr>
             <w:tcW w:w="755" w:type="dxa"/>
@@ -5590,12 +5380,6 @@
         </w:tc>
       </w:tr>
       <w:tr>
-        <w:tblPrEx>
-          <w:tblCellMar>
-            <w:top w:w="0" w:type="dxa"/>
-            <w:bottom w:w="0" w:type="dxa"/>
-          </w:tblCellMar>
-        </w:tblPrEx>
         <w:tc>
           <w:tcPr>
             <w:tcW w:w="755" w:type="dxa"/>
@@ -5743,12 +5527,6 @@
         </w:tc>
       </w:tr>
       <w:tr>
-        <w:tblPrEx>
-          <w:tblCellMar>
-            <w:top w:w="0" w:type="dxa"/>
-            <w:bottom w:w="0" w:type="dxa"/>
-          </w:tblCellMar>
-        </w:tblPrEx>
         <w:tc>
           <w:tcPr>
             <w:tcW w:w="755" w:type="dxa"/>
@@ -5896,12 +5674,6 @@
         </w:tc>
       </w:tr>
       <w:tr>
-        <w:tblPrEx>
-          <w:tblCellMar>
-            <w:top w:w="0" w:type="dxa"/>
-            <w:bottom w:w="0" w:type="dxa"/>
-          </w:tblCellMar>
-        </w:tblPrEx>
         <w:tc>
           <w:tcPr>
             <w:tcW w:w="755" w:type="dxa"/>
@@ -6049,12 +5821,6 @@
         </w:tc>
       </w:tr>
       <w:tr>
-        <w:tblPrEx>
-          <w:tblCellMar>
-            <w:top w:w="0" w:type="dxa"/>
-            <w:bottom w:w="0" w:type="dxa"/>
-          </w:tblCellMar>
-        </w:tblPrEx>
         <w:tc>
           <w:tcPr>
             <w:tcW w:w="755" w:type="dxa"/>
@@ -6202,12 +5968,6 @@
         </w:tc>
       </w:tr>
       <w:tr>
-        <w:tblPrEx>
-          <w:tblCellMar>
-            <w:top w:w="0" w:type="dxa"/>
-            <w:bottom w:w="0" w:type="dxa"/>
-          </w:tblCellMar>
-        </w:tblPrEx>
         <w:tc>
           <w:tcPr>
             <w:tcW w:w="755" w:type="dxa"/>
@@ -6355,12 +6115,6 @@
         </w:tc>
       </w:tr>
       <w:tr>
-        <w:tblPrEx>
-          <w:tblCellMar>
-            <w:top w:w="0" w:type="dxa"/>
-            <w:bottom w:w="0" w:type="dxa"/>
-          </w:tblCellMar>
-        </w:tblPrEx>
         <w:tc>
           <w:tcPr>
             <w:tcW w:w="755" w:type="dxa"/>
@@ -6508,12 +6262,6 @@
         </w:tc>
       </w:tr>
       <w:tr>
-        <w:tblPrEx>
-          <w:tblCellMar>
-            <w:top w:w="0" w:type="dxa"/>
-            <w:bottom w:w="0" w:type="dxa"/>
-          </w:tblCellMar>
-        </w:tblPrEx>
         <w:tc>
           <w:tcPr>
             <w:tcW w:w="755" w:type="dxa"/>
@@ -6661,12 +6409,6 @@
         </w:tc>
       </w:tr>
       <w:tr>
-        <w:tblPrEx>
-          <w:tblCellMar>
-            <w:top w:w="0" w:type="dxa"/>
-            <w:bottom w:w="0" w:type="dxa"/>
-          </w:tblCellMar>
-        </w:tblPrEx>
         <w:tc>
           <w:tcPr>
             <w:tcW w:w="755" w:type="dxa"/>
@@ -6814,12 +6556,6 @@
         </w:tc>
       </w:tr>
       <w:tr>
-        <w:tblPrEx>
-          <w:tblCellMar>
-            <w:top w:w="0" w:type="dxa"/>
-            <w:bottom w:w="0" w:type="dxa"/>
-          </w:tblCellMar>
-        </w:tblPrEx>
         <w:tc>
           <w:tcPr>
             <w:tcW w:w="755" w:type="dxa"/>
@@ -6967,12 +6703,6 @@
         </w:tc>
       </w:tr>
       <w:tr>
-        <w:tblPrEx>
-          <w:tblCellMar>
-            <w:top w:w="0" w:type="dxa"/>
-            <w:bottom w:w="0" w:type="dxa"/>
-          </w:tblCellMar>
-        </w:tblPrEx>
         <w:tc>
           <w:tcPr>
             <w:tcW w:w="755" w:type="dxa"/>
@@ -7120,12 +6850,6 @@
         </w:tc>
       </w:tr>
       <w:tr>
-        <w:tblPrEx>
-          <w:tblCellMar>
-            <w:top w:w="0" w:type="dxa"/>
-            <w:bottom w:w="0" w:type="dxa"/>
-          </w:tblCellMar>
-        </w:tblPrEx>
         <w:tc>
           <w:tcPr>
             <w:tcW w:w="755" w:type="dxa"/>
@@ -7273,12 +6997,6 @@
         </w:tc>
       </w:tr>
       <w:tr>
-        <w:tblPrEx>
-          <w:tblCellMar>
-            <w:top w:w="0" w:type="dxa"/>
-            <w:bottom w:w="0" w:type="dxa"/>
-          </w:tblCellMar>
-        </w:tblPrEx>
         <w:tc>
           <w:tcPr>
             <w:tcW w:w="755" w:type="dxa"/>
@@ -7506,12 +7224,6 @@
         <w:gridCol w:w="3260"/>
       </w:tblGrid>
       <w:tr>
-        <w:tblPrEx>
-          <w:tblCellMar>
-            <w:top w:w="0" w:type="dxa"/>
-            <w:bottom w:w="0" w:type="dxa"/>
-          </w:tblCellMar>
-        </w:tblPrEx>
         <w:trPr>
           <w:tblHeader/>
         </w:trPr>
@@ -7645,12 +7357,6 @@
         </w:tc>
       </w:tr>
       <w:tr>
-        <w:tblPrEx>
-          <w:tblCellMar>
-            <w:top w:w="0" w:type="dxa"/>
-            <w:bottom w:w="0" w:type="dxa"/>
-          </w:tblCellMar>
-        </w:tblPrEx>
         <w:tc>
           <w:tcPr>
             <w:tcW w:w="900" w:type="dxa"/>
@@ -7769,12 +7475,6 @@
         </w:tc>
       </w:tr>
       <w:tr>
-        <w:tblPrEx>
-          <w:tblCellMar>
-            <w:top w:w="0" w:type="dxa"/>
-            <w:bottom w:w="0" w:type="dxa"/>
-          </w:tblCellMar>
-        </w:tblPrEx>
         <w:tc>
           <w:tcPr>
             <w:tcW w:w="900" w:type="dxa"/>
@@ -7893,12 +7593,6 @@
         </w:tc>
       </w:tr>
       <w:tr>
-        <w:tblPrEx>
-          <w:tblCellMar>
-            <w:top w:w="0" w:type="dxa"/>
-            <w:bottom w:w="0" w:type="dxa"/>
-          </w:tblCellMar>
-        </w:tblPrEx>
         <w:tc>
           <w:tcPr>
             <w:tcW w:w="900" w:type="dxa"/>
@@ -8017,12 +7711,6 @@
         </w:tc>
       </w:tr>
       <w:tr>
-        <w:tblPrEx>
-          <w:tblCellMar>
-            <w:top w:w="0" w:type="dxa"/>
-            <w:bottom w:w="0" w:type="dxa"/>
-          </w:tblCellMar>
-        </w:tblPrEx>
         <w:tc>
           <w:tcPr>
             <w:tcW w:w="900" w:type="dxa"/>
@@ -8141,12 +7829,6 @@
         </w:tc>
       </w:tr>
       <w:tr>
-        <w:tblPrEx>
-          <w:tblCellMar>
-            <w:top w:w="0" w:type="dxa"/>
-            <w:bottom w:w="0" w:type="dxa"/>
-          </w:tblCellMar>
-        </w:tblPrEx>
         <w:tc>
           <w:tcPr>
             <w:tcW w:w="900" w:type="dxa"/>
@@ -8265,12 +7947,6 @@
         </w:tc>
       </w:tr>
       <w:tr>
-        <w:tblPrEx>
-          <w:tblCellMar>
-            <w:top w:w="0" w:type="dxa"/>
-            <w:bottom w:w="0" w:type="dxa"/>
-          </w:tblCellMar>
-        </w:tblPrEx>
         <w:tc>
           <w:tcPr>
             <w:tcW w:w="900" w:type="dxa"/>
@@ -8389,12 +8065,6 @@
         </w:tc>
       </w:tr>
       <w:tr>
-        <w:tblPrEx>
-          <w:tblCellMar>
-            <w:top w:w="0" w:type="dxa"/>
-            <w:bottom w:w="0" w:type="dxa"/>
-          </w:tblCellMar>
-        </w:tblPrEx>
         <w:tc>
           <w:tcPr>
             <w:tcW w:w="900" w:type="dxa"/>
@@ -8601,12 +8271,6 @@
         <w:gridCol w:w="1360"/>
       </w:tblGrid>
       <w:tr>
-        <w:tblPrEx>
-          <w:tblCellMar>
-            <w:top w:w="0" w:type="dxa"/>
-            <w:bottom w:w="0" w:type="dxa"/>
-          </w:tblCellMar>
-        </w:tblPrEx>
         <w:trPr>
           <w:tblHeader/>
         </w:trPr>
@@ -8740,12 +8404,6 @@
         </w:tc>
       </w:tr>
       <w:tr>
-        <w:tblPrEx>
-          <w:tblCellMar>
-            <w:top w:w="0" w:type="dxa"/>
-            <w:bottom w:w="0" w:type="dxa"/>
-          </w:tblCellMar>
-        </w:tblPrEx>
         <w:tc>
           <w:tcPr>
             <w:tcW w:w="800" w:type="dxa"/>
@@ -8864,12 +8522,6 @@
         </w:tc>
       </w:tr>
       <w:tr>
-        <w:tblPrEx>
-          <w:tblCellMar>
-            <w:top w:w="0" w:type="dxa"/>
-            <w:bottom w:w="0" w:type="dxa"/>
-          </w:tblCellMar>
-        </w:tblPrEx>
         <w:tc>
           <w:tcPr>
             <w:tcW w:w="800" w:type="dxa"/>
@@ -8988,12 +8640,6 @@
         </w:tc>
       </w:tr>
       <w:tr>
-        <w:tblPrEx>
-          <w:tblCellMar>
-            <w:top w:w="0" w:type="dxa"/>
-            <w:bottom w:w="0" w:type="dxa"/>
-          </w:tblCellMar>
-        </w:tblPrEx>
         <w:tc>
           <w:tcPr>
             <w:tcW w:w="800" w:type="dxa"/>
@@ -9112,12 +8758,6 @@
         </w:tc>
       </w:tr>
       <w:tr>
-        <w:tblPrEx>
-          <w:tblCellMar>
-            <w:top w:w="0" w:type="dxa"/>
-            <w:bottom w:w="0" w:type="dxa"/>
-          </w:tblCellMar>
-        </w:tblPrEx>
         <w:tc>
           <w:tcPr>
             <w:tcW w:w="800" w:type="dxa"/>
@@ -9237,12 +8877,6 @@
         </w:tc>
       </w:tr>
       <w:tr>
-        <w:tblPrEx>
-          <w:tblCellMar>
-            <w:top w:w="0" w:type="dxa"/>
-            <w:bottom w:w="0" w:type="dxa"/>
-          </w:tblCellMar>
-        </w:tblPrEx>
         <w:tc>
           <w:tcPr>
             <w:tcW w:w="800" w:type="dxa"/>
@@ -9361,12 +8995,6 @@
         </w:tc>
       </w:tr>
       <w:tr>
-        <w:tblPrEx>
-          <w:tblCellMar>
-            <w:top w:w="0" w:type="dxa"/>
-            <w:bottom w:w="0" w:type="dxa"/>
-          </w:tblCellMar>
-        </w:tblPrEx>
         <w:tc>
           <w:tcPr>
             <w:tcW w:w="800" w:type="dxa"/>
@@ -9485,12 +9113,6 @@
         </w:tc>
       </w:tr>
       <w:tr>
-        <w:tblPrEx>
-          <w:tblCellMar>
-            <w:top w:w="0" w:type="dxa"/>
-            <w:bottom w:w="0" w:type="dxa"/>
-          </w:tblCellMar>
-        </w:tblPrEx>
         <w:tc>
           <w:tcPr>
             <w:tcW w:w="800" w:type="dxa"/>
@@ -9609,12 +9231,6 @@
         </w:tc>
       </w:tr>
       <w:tr>
-        <w:tblPrEx>
-          <w:tblCellMar>
-            <w:top w:w="0" w:type="dxa"/>
-            <w:bottom w:w="0" w:type="dxa"/>
-          </w:tblCellMar>
-        </w:tblPrEx>
         <w:tc>
           <w:tcPr>
             <w:tcW w:w="800" w:type="dxa"/>
@@ -9733,12 +9349,6 @@
         </w:tc>
       </w:tr>
       <w:tr>
-        <w:tblPrEx>
-          <w:tblCellMar>
-            <w:top w:w="0" w:type="dxa"/>
-            <w:bottom w:w="0" w:type="dxa"/>
-          </w:tblCellMar>
-        </w:tblPrEx>
         <w:tc>
           <w:tcPr>
             <w:tcW w:w="800" w:type="dxa"/>
@@ -9857,12 +9467,6 @@
         </w:tc>
       </w:tr>
       <w:tr>
-        <w:tblPrEx>
-          <w:tblCellMar>
-            <w:top w:w="0" w:type="dxa"/>
-            <w:bottom w:w="0" w:type="dxa"/>
-          </w:tblCellMar>
-        </w:tblPrEx>
         <w:tc>
           <w:tcPr>
             <w:tcW w:w="800" w:type="dxa"/>
@@ -9981,12 +9585,6 @@
         </w:tc>
       </w:tr>
       <w:tr>
-        <w:tblPrEx>
-          <w:tblCellMar>
-            <w:top w:w="0" w:type="dxa"/>
-            <w:bottom w:w="0" w:type="dxa"/>
-          </w:tblCellMar>
-        </w:tblPrEx>
         <w:tc>
           <w:tcPr>
             <w:tcW w:w="800" w:type="dxa"/>
@@ -10105,12 +9703,6 @@
         </w:tc>
       </w:tr>
       <w:tr>
-        <w:tblPrEx>
-          <w:tblCellMar>
-            <w:top w:w="0" w:type="dxa"/>
-            <w:bottom w:w="0" w:type="dxa"/>
-          </w:tblCellMar>
-        </w:tblPrEx>
         <w:tc>
           <w:tcPr>
             <w:tcW w:w="800" w:type="dxa"/>
@@ -10317,12 +9909,6 @@
         <w:gridCol w:w="2860"/>
       </w:tblGrid>
       <w:tr>
-        <w:tblPrEx>
-          <w:tblCellMar>
-            <w:top w:w="0" w:type="dxa"/>
-            <w:bottom w:w="0" w:type="dxa"/>
-          </w:tblCellMar>
-        </w:tblPrEx>
         <w:trPr>
           <w:tblHeader/>
         </w:trPr>
@@ -10456,12 +10042,6 @@
         </w:tc>
       </w:tr>
       <w:tr>
-        <w:tblPrEx>
-          <w:tblCellMar>
-            <w:top w:w="0" w:type="dxa"/>
-            <w:bottom w:w="0" w:type="dxa"/>
-          </w:tblCellMar>
-        </w:tblPrEx>
         <w:tc>
           <w:tcPr>
             <w:tcW w:w="1700" w:type="dxa"/>
@@ -10580,12 +10160,6 @@
         </w:tc>
       </w:tr>
       <w:tr>
-        <w:tblPrEx>
-          <w:tblCellMar>
-            <w:top w:w="0" w:type="dxa"/>
-            <w:bottom w:w="0" w:type="dxa"/>
-          </w:tblCellMar>
-        </w:tblPrEx>
         <w:tc>
           <w:tcPr>
             <w:tcW w:w="1700" w:type="dxa"/>
@@ -10704,12 +10278,6 @@
         </w:tc>
       </w:tr>
       <w:tr>
-        <w:tblPrEx>
-          <w:tblCellMar>
-            <w:top w:w="0" w:type="dxa"/>
-            <w:bottom w:w="0" w:type="dxa"/>
-          </w:tblCellMar>
-        </w:tblPrEx>
         <w:tc>
           <w:tcPr>
             <w:tcW w:w="1700" w:type="dxa"/>
@@ -10829,12 +10397,6 @@
         </w:tc>
       </w:tr>
       <w:tr>
-        <w:tblPrEx>
-          <w:tblCellMar>
-            <w:top w:w="0" w:type="dxa"/>
-            <w:bottom w:w="0" w:type="dxa"/>
-          </w:tblCellMar>
-        </w:tblPrEx>
         <w:tc>
           <w:tcPr>
             <w:tcW w:w="1700" w:type="dxa"/>
@@ -10953,12 +10515,6 @@
         </w:tc>
       </w:tr>
       <w:tr>
-        <w:tblPrEx>
-          <w:tblCellMar>
-            <w:top w:w="0" w:type="dxa"/>
-            <w:bottom w:w="0" w:type="dxa"/>
-          </w:tblCellMar>
-        </w:tblPrEx>
         <w:tc>
           <w:tcPr>
             <w:tcW w:w="1700" w:type="dxa"/>
@@ -11077,12 +10633,6 @@
         </w:tc>
       </w:tr>
       <w:tr>
-        <w:tblPrEx>
-          <w:tblCellMar>
-            <w:top w:w="0" w:type="dxa"/>
-            <w:bottom w:w="0" w:type="dxa"/>
-          </w:tblCellMar>
-        </w:tblPrEx>
         <w:tc>
           <w:tcPr>
             <w:tcW w:w="1700" w:type="dxa"/>
@@ -11201,12 +10751,6 @@
         </w:tc>
       </w:tr>
       <w:tr>
-        <w:tblPrEx>
-          <w:tblCellMar>
-            <w:top w:w="0" w:type="dxa"/>
-            <w:bottom w:w="0" w:type="dxa"/>
-          </w:tblCellMar>
-        </w:tblPrEx>
         <w:tc>
           <w:tcPr>
             <w:tcW w:w="1700" w:type="dxa"/>
@@ -11325,12 +10869,6 @@
         </w:tc>
       </w:tr>
       <w:tr>
-        <w:tblPrEx>
-          <w:tblCellMar>
-            <w:top w:w="0" w:type="dxa"/>
-            <w:bottom w:w="0" w:type="dxa"/>
-          </w:tblCellMar>
-        </w:tblPrEx>
         <w:tc>
           <w:tcPr>
             <w:tcW w:w="1700" w:type="dxa"/>
@@ -11449,12 +10987,6 @@
         </w:tc>
       </w:tr>
       <w:tr>
-        <w:tblPrEx>
-          <w:tblCellMar>
-            <w:top w:w="0" w:type="dxa"/>
-            <w:bottom w:w="0" w:type="dxa"/>
-          </w:tblCellMar>
-        </w:tblPrEx>
         <w:tc>
           <w:tcPr>
             <w:tcW w:w="1700" w:type="dxa"/>
@@ -11573,12 +11105,6 @@
         </w:tc>
       </w:tr>
       <w:tr>
-        <w:tblPrEx>
-          <w:tblCellMar>
-            <w:top w:w="0" w:type="dxa"/>
-            <w:bottom w:w="0" w:type="dxa"/>
-          </w:tblCellMar>
-        </w:tblPrEx>
         <w:tc>
           <w:tcPr>
             <w:tcW w:w="1700" w:type="dxa"/>
@@ -11830,12 +11356,6 @@
         <w:gridCol w:w="1083"/>
       </w:tblGrid>
       <w:tr>
-        <w:tblPrEx>
-          <w:tblCellMar>
-            <w:top w:w="0" w:type="dxa"/>
-            <w:bottom w:w="0" w:type="dxa"/>
-          </w:tblCellMar>
-        </w:tblPrEx>
         <w:trPr>
           <w:tblHeader/>
         </w:trPr>
@@ -12033,12 +11553,6 @@
         </w:tc>
       </w:tr>
       <w:tr>
-        <w:tblPrEx>
-          <w:tblCellMar>
-            <w:top w:w="0" w:type="dxa"/>
-            <w:bottom w:w="0" w:type="dxa"/>
-          </w:tblCellMar>
-        </w:tblPrEx>
         <w:tc>
           <w:tcPr>
             <w:tcW w:w="887" w:type="dxa"/>
@@ -12215,12 +11729,6 @@
         </w:tc>
       </w:tr>
       <w:tr>
-        <w:tblPrEx>
-          <w:tblCellMar>
-            <w:top w:w="0" w:type="dxa"/>
-            <w:bottom w:w="0" w:type="dxa"/>
-          </w:tblCellMar>
-        </w:tblPrEx>
         <w:tc>
           <w:tcPr>
             <w:tcW w:w="887" w:type="dxa"/>
@@ -12397,12 +11905,6 @@
         </w:tc>
       </w:tr>
       <w:tr>
-        <w:tblPrEx>
-          <w:tblCellMar>
-            <w:top w:w="0" w:type="dxa"/>
-            <w:bottom w:w="0" w:type="dxa"/>
-          </w:tblCellMar>
-        </w:tblPrEx>
         <w:tc>
           <w:tcPr>
             <w:tcW w:w="887" w:type="dxa"/>
@@ -12604,12 +12106,6 @@
         </w:tc>
       </w:tr>
       <w:tr>
-        <w:tblPrEx>
-          <w:tblCellMar>
-            <w:top w:w="0" w:type="dxa"/>
-            <w:bottom w:w="0" w:type="dxa"/>
-          </w:tblCellMar>
-        </w:tblPrEx>
         <w:tc>
           <w:tcPr>
             <w:tcW w:w="887" w:type="dxa"/>
@@ -12786,12 +12282,6 @@
         </w:tc>
       </w:tr>
       <w:tr>
-        <w:tblPrEx>
-          <w:tblCellMar>
-            <w:top w:w="0" w:type="dxa"/>
-            <w:bottom w:w="0" w:type="dxa"/>
-          </w:tblCellMar>
-        </w:tblPrEx>
         <w:tc>
           <w:tcPr>
             <w:tcW w:w="887" w:type="dxa"/>
@@ -12968,12 +12458,6 @@
         </w:tc>
       </w:tr>
       <w:tr>
-        <w:tblPrEx>
-          <w:tblCellMar>
-            <w:top w:w="0" w:type="dxa"/>
-            <w:bottom w:w="0" w:type="dxa"/>
-          </w:tblCellMar>
-        </w:tblPrEx>
         <w:tc>
           <w:tcPr>
             <w:tcW w:w="887" w:type="dxa"/>
@@ -13150,12 +12634,6 @@
         </w:tc>
       </w:tr>
       <w:tr>
-        <w:tblPrEx>
-          <w:tblCellMar>
-            <w:top w:w="0" w:type="dxa"/>
-            <w:bottom w:w="0" w:type="dxa"/>
-          </w:tblCellMar>
-        </w:tblPrEx>
         <w:tc>
           <w:tcPr>
             <w:tcW w:w="887" w:type="dxa"/>
@@ -13332,12 +12810,6 @@
         </w:tc>
       </w:tr>
       <w:tr>
-        <w:tblPrEx>
-          <w:tblCellMar>
-            <w:top w:w="0" w:type="dxa"/>
-            <w:bottom w:w="0" w:type="dxa"/>
-          </w:tblCellMar>
-        </w:tblPrEx>
         <w:tc>
           <w:tcPr>
             <w:tcW w:w="887" w:type="dxa"/>
@@ -13514,12 +12986,6 @@
         </w:tc>
       </w:tr>
       <w:tr>
-        <w:tblPrEx>
-          <w:tblCellMar>
-            <w:top w:w="0" w:type="dxa"/>
-            <w:bottom w:w="0" w:type="dxa"/>
-          </w:tblCellMar>
-        </w:tblPrEx>
         <w:tc>
           <w:tcPr>
             <w:tcW w:w="887" w:type="dxa"/>
@@ -13696,12 +13162,6 @@
         </w:tc>
       </w:tr>
       <w:tr>
-        <w:tblPrEx>
-          <w:tblCellMar>
-            <w:top w:w="0" w:type="dxa"/>
-            <w:bottom w:w="0" w:type="dxa"/>
-          </w:tblCellMar>
-        </w:tblPrEx>
         <w:tc>
           <w:tcPr>
             <w:tcW w:w="887" w:type="dxa"/>
@@ -13887,12 +13347,6 @@
         </w:tc>
       </w:tr>
       <w:tr>
-        <w:tblPrEx>
-          <w:tblCellMar>
-            <w:top w:w="0" w:type="dxa"/>
-            <w:bottom w:w="0" w:type="dxa"/>
-          </w:tblCellMar>
-        </w:tblPrEx>
         <w:tc>
           <w:tcPr>
             <w:tcW w:w="887" w:type="dxa"/>
@@ -14078,12 +13532,6 @@
         </w:tc>
       </w:tr>
       <w:tr>
-        <w:tblPrEx>
-          <w:tblCellMar>
-            <w:top w:w="0" w:type="dxa"/>
-            <w:bottom w:w="0" w:type="dxa"/>
-          </w:tblCellMar>
-        </w:tblPrEx>
         <w:tc>
           <w:tcPr>
             <w:tcW w:w="887" w:type="dxa"/>
@@ -14260,12 +13708,6 @@
         </w:tc>
       </w:tr>
       <w:tr>
-        <w:tblPrEx>
-          <w:tblCellMar>
-            <w:top w:w="0" w:type="dxa"/>
-            <w:bottom w:w="0" w:type="dxa"/>
-          </w:tblCellMar>
-        </w:tblPrEx>
         <w:tc>
           <w:tcPr>
             <w:tcW w:w="887" w:type="dxa"/>
@@ -14460,12 +13902,6 @@
         </w:tc>
       </w:tr>
       <w:tr>
-        <w:tblPrEx>
-          <w:tblCellMar>
-            <w:top w:w="0" w:type="dxa"/>
-            <w:bottom w:w="0" w:type="dxa"/>
-          </w:tblCellMar>
-        </w:tblPrEx>
         <w:tc>
           <w:tcPr>
             <w:tcW w:w="887" w:type="dxa"/>
@@ -14642,12 +14078,6 @@
         </w:tc>
       </w:tr>
       <w:tr>
-        <w:tblPrEx>
-          <w:tblCellMar>
-            <w:top w:w="0" w:type="dxa"/>
-            <w:bottom w:w="0" w:type="dxa"/>
-          </w:tblCellMar>
-        </w:tblPrEx>
         <w:tc>
           <w:tcPr>
             <w:tcW w:w="887" w:type="dxa"/>
@@ -14856,12 +14286,6 @@
         </w:tc>
       </w:tr>
       <w:tr>
-        <w:tblPrEx>
-          <w:tblCellMar>
-            <w:top w:w="0" w:type="dxa"/>
-            <w:bottom w:w="0" w:type="dxa"/>
-          </w:tblCellMar>
-        </w:tblPrEx>
         <w:tc>
           <w:tcPr>
             <w:tcW w:w="887" w:type="dxa"/>
@@ -15324,7 +14748,15 @@
         <w:t>/</w:t>
       </w:r>
       <w:r>
-        <w:t>: contienen las reglas del flujo, por ejemplo que no se puede aprobar sin descripción ni entregar sin aprobación.</w:t>
+        <w:t xml:space="preserve">: contienen las reglas del flujo, por </w:t>
+      </w:r>
+      <w:proofErr w:type="gramStart"/>
+      <w:r>
+        <w:t>ejemplo</w:t>
+      </w:r>
+      <w:proofErr w:type="gramEnd"/>
+      <w:r>
+        <w:t xml:space="preserve"> que no se puede aprobar sin descripción ni entregar sin aprobación.</w:t>
       </w:r>
     </w:p>
     <w:p>
@@ -16101,12 +15533,6 @@
         <w:gridCol w:w="4360"/>
       </w:tblGrid>
       <w:tr>
-        <w:tblPrEx>
-          <w:tblCellMar>
-            <w:top w:w="0" w:type="dxa"/>
-            <w:bottom w:w="0" w:type="dxa"/>
-          </w:tblCellMar>
-        </w:tblPrEx>
         <w:trPr>
           <w:tblHeader/>
         </w:trPr>
@@ -16208,12 +15634,6 @@
         </w:tc>
       </w:tr>
       <w:tr>
-        <w:tblPrEx>
-          <w:tblCellMar>
-            <w:top w:w="0" w:type="dxa"/>
-            <w:bottom w:w="0" w:type="dxa"/>
-          </w:tblCellMar>
-        </w:tblPrEx>
         <w:tc>
           <w:tcPr>
             <w:tcW w:w="1800" w:type="dxa"/>
@@ -16353,12 +15773,6 @@
         </w:tc>
       </w:tr>
       <w:tr>
-        <w:tblPrEx>
-          <w:tblCellMar>
-            <w:top w:w="0" w:type="dxa"/>
-            <w:bottom w:w="0" w:type="dxa"/>
-          </w:tblCellMar>
-        </w:tblPrEx>
         <w:tc>
           <w:tcPr>
             <w:tcW w:w="1800" w:type="dxa"/>
@@ -16548,12 +15962,6 @@
         </w:tc>
       </w:tr>
       <w:tr>
-        <w:tblPrEx>
-          <w:tblCellMar>
-            <w:top w:w="0" w:type="dxa"/>
-            <w:bottom w:w="0" w:type="dxa"/>
-          </w:tblCellMar>
-        </w:tblPrEx>
         <w:tc>
           <w:tcPr>
             <w:tcW w:w="1800" w:type="dxa"/>
@@ -16668,12 +16076,6 @@
         </w:tc>
       </w:tr>
       <w:tr>
-        <w:tblPrEx>
-          <w:tblCellMar>
-            <w:top w:w="0" w:type="dxa"/>
-            <w:bottom w:w="0" w:type="dxa"/>
-          </w:tblCellMar>
-        </w:tblPrEx>
         <w:tc>
           <w:tcPr>
             <w:tcW w:w="1800" w:type="dxa"/>
@@ -16772,12 +16174,6 @@
         </w:tc>
       </w:tr>
       <w:tr>
-        <w:tblPrEx>
-          <w:tblCellMar>
-            <w:top w:w="0" w:type="dxa"/>
-            <w:bottom w:w="0" w:type="dxa"/>
-          </w:tblCellMar>
-        </w:tblPrEx>
         <w:tc>
           <w:tcPr>
             <w:tcW w:w="1800" w:type="dxa"/>
@@ -16917,12 +16313,6 @@
         </w:tc>
       </w:tr>
       <w:tr>
-        <w:tblPrEx>
-          <w:tblCellMar>
-            <w:top w:w="0" w:type="dxa"/>
-            <w:bottom w:w="0" w:type="dxa"/>
-          </w:tblCellMar>
-        </w:tblPrEx>
         <w:tc>
           <w:tcPr>
             <w:tcW w:w="1800" w:type="dxa"/>
@@ -17060,12 +16450,6 @@
         </w:tc>
       </w:tr>
       <w:tr>
-        <w:tblPrEx>
-          <w:tblCellMar>
-            <w:top w:w="0" w:type="dxa"/>
-            <w:bottom w:w="0" w:type="dxa"/>
-          </w:tblCellMar>
-        </w:tblPrEx>
         <w:tc>
           <w:tcPr>
             <w:tcW w:w="1800" w:type="dxa"/>
@@ -17235,12 +16619,6 @@
         <w:gridCol w:w="1160"/>
       </w:tblGrid>
       <w:tr>
-        <w:tblPrEx>
-          <w:tblCellMar>
-            <w:top w:w="0" w:type="dxa"/>
-            <w:bottom w:w="0" w:type="dxa"/>
-          </w:tblCellMar>
-        </w:tblPrEx>
         <w:trPr>
           <w:tblHeader/>
         </w:trPr>
@@ -17406,12 +16784,6 @@
         </w:tc>
       </w:tr>
       <w:tr>
-        <w:tblPrEx>
-          <w:tblCellMar>
-            <w:top w:w="0" w:type="dxa"/>
-            <w:bottom w:w="0" w:type="dxa"/>
-          </w:tblCellMar>
-        </w:tblPrEx>
         <w:tc>
           <w:tcPr>
             <w:tcW w:w="1700" w:type="dxa"/>
@@ -17559,12 +16931,6 @@
         </w:tc>
       </w:tr>
       <w:tr>
-        <w:tblPrEx>
-          <w:tblCellMar>
-            <w:top w:w="0" w:type="dxa"/>
-            <w:bottom w:w="0" w:type="dxa"/>
-          </w:tblCellMar>
-        </w:tblPrEx>
         <w:tc>
           <w:tcPr>
             <w:tcW w:w="1700" w:type="dxa"/>
@@ -17712,12 +17078,6 @@
         </w:tc>
       </w:tr>
       <w:tr>
-        <w:tblPrEx>
-          <w:tblCellMar>
-            <w:top w:w="0" w:type="dxa"/>
-            <w:bottom w:w="0" w:type="dxa"/>
-          </w:tblCellMar>
-        </w:tblPrEx>
         <w:tc>
           <w:tcPr>
             <w:tcW w:w="1700" w:type="dxa"/>
@@ -17890,12 +17250,6 @@
         </w:tc>
       </w:tr>
       <w:tr>
-        <w:tblPrEx>
-          <w:tblCellMar>
-            <w:top w:w="0" w:type="dxa"/>
-            <w:bottom w:w="0" w:type="dxa"/>
-          </w:tblCellMar>
-        </w:tblPrEx>
         <w:tc>
           <w:tcPr>
             <w:tcW w:w="1700" w:type="dxa"/>
@@ -18133,12 +17487,6 @@
         <w:gridCol w:w="1500"/>
       </w:tblGrid>
       <w:tr>
-        <w:tblPrEx>
-          <w:tblCellMar>
-            <w:top w:w="0" w:type="dxa"/>
-            <w:bottom w:w="0" w:type="dxa"/>
-          </w:tblCellMar>
-        </w:tblPrEx>
         <w:trPr>
           <w:tblHeader/>
         </w:trPr>
@@ -18304,12 +17652,6 @@
         </w:tc>
       </w:tr>
       <w:tr>
-        <w:tblPrEx>
-          <w:tblCellMar>
-            <w:top w:w="0" w:type="dxa"/>
-            <w:bottom w:w="0" w:type="dxa"/>
-          </w:tblCellMar>
-        </w:tblPrEx>
         <w:tc>
           <w:tcPr>
             <w:tcW w:w="2400" w:type="dxa"/>
@@ -18457,12 +17799,6 @@
         </w:tc>
       </w:tr>
       <w:tr>
-        <w:tblPrEx>
-          <w:tblCellMar>
-            <w:top w:w="0" w:type="dxa"/>
-            <w:bottom w:w="0" w:type="dxa"/>
-          </w:tblCellMar>
-        </w:tblPrEx>
         <w:tc>
           <w:tcPr>
             <w:tcW w:w="2400" w:type="dxa"/>
@@ -18651,12 +17987,6 @@
         </w:tc>
       </w:tr>
       <w:tr>
-        <w:tblPrEx>
-          <w:tblCellMar>
-            <w:top w:w="0" w:type="dxa"/>
-            <w:bottom w:w="0" w:type="dxa"/>
-          </w:tblCellMar>
-        </w:tblPrEx>
         <w:tc>
           <w:tcPr>
             <w:tcW w:w="2400" w:type="dxa"/>
@@ -18804,12 +18134,6 @@
         </w:tc>
       </w:tr>
       <w:tr>
-        <w:tblPrEx>
-          <w:tblCellMar>
-            <w:top w:w="0" w:type="dxa"/>
-            <w:bottom w:w="0" w:type="dxa"/>
-          </w:tblCellMar>
-        </w:tblPrEx>
         <w:tc>
           <w:tcPr>
             <w:tcW w:w="2400" w:type="dxa"/>
@@ -18973,12 +18297,6 @@
         </w:tc>
       </w:tr>
       <w:tr>
-        <w:tblPrEx>
-          <w:tblCellMar>
-            <w:top w:w="0" w:type="dxa"/>
-            <w:bottom w:w="0" w:type="dxa"/>
-          </w:tblCellMar>
-        </w:tblPrEx>
         <w:tc>
           <w:tcPr>
             <w:tcW w:w="2400" w:type="dxa"/>
@@ -19151,12 +18469,6 @@
         </w:tc>
       </w:tr>
       <w:tr>
-        <w:tblPrEx>
-          <w:tblCellMar>
-            <w:top w:w="0" w:type="dxa"/>
-            <w:bottom w:w="0" w:type="dxa"/>
-          </w:tblCellMar>
-        </w:tblPrEx>
         <w:tc>
           <w:tcPr>
             <w:tcW w:w="2400" w:type="dxa"/>
@@ -19432,12 +18744,6 @@
         <w:gridCol w:w="4160"/>
       </w:tblGrid>
       <w:tr>
-        <w:tblPrEx>
-          <w:tblCellMar>
-            <w:top w:w="0" w:type="dxa"/>
-            <w:bottom w:w="0" w:type="dxa"/>
-          </w:tblCellMar>
-        </w:tblPrEx>
         <w:trPr>
           <w:tblHeader/>
         </w:trPr>
@@ -19539,12 +18845,6 @@
         </w:tc>
       </w:tr>
       <w:tr>
-        <w:tblPrEx>
-          <w:tblCellMar>
-            <w:top w:w="0" w:type="dxa"/>
-            <w:bottom w:w="0" w:type="dxa"/>
-          </w:tblCellMar>
-        </w:tblPrEx>
         <w:tc>
           <w:tcPr>
             <w:tcW w:w="3800" w:type="dxa"/>
@@ -19634,12 +18934,6 @@
         </w:tc>
       </w:tr>
       <w:tr>
-        <w:tblPrEx>
-          <w:tblCellMar>
-            <w:top w:w="0" w:type="dxa"/>
-            <w:bottom w:w="0" w:type="dxa"/>
-          </w:tblCellMar>
-        </w:tblPrEx>
         <w:tc>
           <w:tcPr>
             <w:tcW w:w="3800" w:type="dxa"/>
@@ -19729,12 +19023,6 @@
         </w:tc>
       </w:tr>
       <w:tr>
-        <w:tblPrEx>
-          <w:tblCellMar>
-            <w:top w:w="0" w:type="dxa"/>
-            <w:bottom w:w="0" w:type="dxa"/>
-          </w:tblCellMar>
-        </w:tblPrEx>
         <w:tc>
           <w:tcPr>
             <w:tcW w:w="3800" w:type="dxa"/>
@@ -19824,12 +19112,6 @@
         </w:tc>
       </w:tr>
       <w:tr>
-        <w:tblPrEx>
-          <w:tblCellMar>
-            <w:top w:w="0" w:type="dxa"/>
-            <w:bottom w:w="0" w:type="dxa"/>
-          </w:tblCellMar>
-        </w:tblPrEx>
         <w:tc>
           <w:tcPr>
             <w:tcW w:w="3800" w:type="dxa"/>
@@ -19919,12 +19201,6 @@
         </w:tc>
       </w:tr>
       <w:tr>
-        <w:tblPrEx>
-          <w:tblCellMar>
-            <w:top w:w="0" w:type="dxa"/>
-            <w:bottom w:w="0" w:type="dxa"/>
-          </w:tblCellMar>
-        </w:tblPrEx>
         <w:tc>
           <w:tcPr>
             <w:tcW w:w="3800" w:type="dxa"/>
@@ -20014,12 +19290,6 @@
         </w:tc>
       </w:tr>
       <w:tr>
-        <w:tblPrEx>
-          <w:tblCellMar>
-            <w:top w:w="0" w:type="dxa"/>
-            <w:bottom w:w="0" w:type="dxa"/>
-          </w:tblCellMar>
-        </w:tblPrEx>
         <w:tc>
           <w:tcPr>
             <w:tcW w:w="3800" w:type="dxa"/>
@@ -20233,12 +19503,6 @@
         <w:gridCol w:w="2032"/>
       </w:tblGrid>
       <w:tr>
-        <w:tblPrEx>
-          <w:tblCellMar>
-            <w:top w:w="0" w:type="dxa"/>
-            <w:bottom w:w="0" w:type="dxa"/>
-          </w:tblCellMar>
-        </w:tblPrEx>
         <w:trPr>
           <w:tblHeader/>
         </w:trPr>
@@ -20404,12 +19668,6 @@
         </w:tc>
       </w:tr>
       <w:tr>
-        <w:tblPrEx>
-          <w:tblCellMar>
-            <w:top w:w="0" w:type="dxa"/>
-            <w:bottom w:w="0" w:type="dxa"/>
-          </w:tblCellMar>
-        </w:tblPrEx>
         <w:tc>
           <w:tcPr>
             <w:tcW w:w="1000" w:type="dxa"/>
@@ -20582,12 +19840,6 @@
         </w:tc>
       </w:tr>
       <w:tr>
-        <w:tblPrEx>
-          <w:tblCellMar>
-            <w:top w:w="0" w:type="dxa"/>
-            <w:bottom w:w="0" w:type="dxa"/>
-          </w:tblCellMar>
-        </w:tblPrEx>
         <w:tc>
           <w:tcPr>
             <w:tcW w:w="1000" w:type="dxa"/>
@@ -20792,12 +20044,6 @@
         </w:tc>
       </w:tr>
       <w:tr>
-        <w:tblPrEx>
-          <w:tblCellMar>
-            <w:top w:w="0" w:type="dxa"/>
-            <w:bottom w:w="0" w:type="dxa"/>
-          </w:tblCellMar>
-        </w:tblPrEx>
         <w:tc>
           <w:tcPr>
             <w:tcW w:w="1000" w:type="dxa"/>
@@ -20997,12 +20243,6 @@
         </w:tc>
       </w:tr>
       <w:tr>
-        <w:tblPrEx>
-          <w:tblCellMar>
-            <w:top w:w="0" w:type="dxa"/>
-            <w:bottom w:w="0" w:type="dxa"/>
-          </w:tblCellMar>
-        </w:tblPrEx>
         <w:tc>
           <w:tcPr>
             <w:tcW w:w="1000" w:type="dxa"/>
@@ -21209,24 +20449,15 @@
     </w:tbl>
     <w:p>
       <w:pPr>
-        <w:spacing w:before="60" w:after="240"/>
-      </w:pPr>
-      <w:r>
+        <w:spacing w:after="160" w:line="300" w:lineRule="auto"/>
+        <w:jc w:val="both"/>
         <w:rPr>
           <w:i/>
           <w:iCs/>
           <w:sz w:val="19"/>
           <w:szCs w:val="19"/>
         </w:rPr>
-        <w:t>Nota.</w:t>
-      </w:r>
-      <w:r>
-        <w:rPr>
-          <w:sz w:val="19"/>
-          <w:szCs w:val="19"/>
-        </w:rPr>
-        <w:t xml:space="preserve"> Elaboración propia.</w:t>
-      </w:r>
+      </w:pPr>
     </w:p>
     <w:p>
       <w:pPr>
@@ -21305,12 +20536,6 @@
         <w:gridCol w:w="1560"/>
       </w:tblGrid>
       <w:tr>
-        <w:tblPrEx>
-          <w:tblCellMar>
-            <w:top w:w="0" w:type="dxa"/>
-            <w:bottom w:w="0" w:type="dxa"/>
-          </w:tblCellMar>
-        </w:tblPrEx>
         <w:trPr>
           <w:tblHeader/>
         </w:trPr>
@@ -21476,12 +20701,6 @@
         </w:tc>
       </w:tr>
       <w:tr>
-        <w:tblPrEx>
-          <w:tblCellMar>
-            <w:top w:w="0" w:type="dxa"/>
-            <w:bottom w:w="0" w:type="dxa"/>
-          </w:tblCellMar>
-        </w:tblPrEx>
         <w:tc>
           <w:tcPr>
             <w:tcW w:w="750" w:type="dxa"/>
@@ -21645,12 +20864,6 @@
         </w:tc>
       </w:tr>
       <w:tr>
-        <w:tblPrEx>
-          <w:tblCellMar>
-            <w:top w:w="0" w:type="dxa"/>
-            <w:bottom w:w="0" w:type="dxa"/>
-          </w:tblCellMar>
-        </w:tblPrEx>
         <w:tc>
           <w:tcPr>
             <w:tcW w:w="750" w:type="dxa"/>
@@ -21798,12 +21011,6 @@
         </w:tc>
       </w:tr>
       <w:tr>
-        <w:tblPrEx>
-          <w:tblCellMar>
-            <w:top w:w="0" w:type="dxa"/>
-            <w:bottom w:w="0" w:type="dxa"/>
-          </w:tblCellMar>
-        </w:tblPrEx>
         <w:tc>
           <w:tcPr>
             <w:tcW w:w="750" w:type="dxa"/>
@@ -21951,12 +21158,6 @@
         </w:tc>
       </w:tr>
       <w:tr>
-        <w:tblPrEx>
-          <w:tblCellMar>
-            <w:top w:w="0" w:type="dxa"/>
-            <w:bottom w:w="0" w:type="dxa"/>
-          </w:tblCellMar>
-        </w:tblPrEx>
         <w:tc>
           <w:tcPr>
             <w:tcW w:w="750" w:type="dxa"/>
@@ -22104,12 +21305,6 @@
         </w:tc>
       </w:tr>
       <w:tr>
-        <w:tblPrEx>
-          <w:tblCellMar>
-            <w:top w:w="0" w:type="dxa"/>
-            <w:bottom w:w="0" w:type="dxa"/>
-          </w:tblCellMar>
-        </w:tblPrEx>
         <w:tc>
           <w:tcPr>
             <w:tcW w:w="750" w:type="dxa"/>
@@ -22257,12 +21452,6 @@
         </w:tc>
       </w:tr>
       <w:tr>
-        <w:tblPrEx>
-          <w:tblCellMar>
-            <w:top w:w="0" w:type="dxa"/>
-            <w:bottom w:w="0" w:type="dxa"/>
-          </w:tblCellMar>
-        </w:tblPrEx>
         <w:tc>
           <w:tcPr>
             <w:tcW w:w="750" w:type="dxa"/>
@@ -22410,12 +21599,6 @@
         </w:tc>
       </w:tr>
       <w:tr>
-        <w:tblPrEx>
-          <w:tblCellMar>
-            <w:top w:w="0" w:type="dxa"/>
-            <w:bottom w:w="0" w:type="dxa"/>
-          </w:tblCellMar>
-        </w:tblPrEx>
         <w:tc>
           <w:tcPr>
             <w:tcW w:w="750" w:type="dxa"/>
@@ -22579,12 +21762,6 @@
         </w:tc>
       </w:tr>
       <w:tr>
-        <w:tblPrEx>
-          <w:tblCellMar>
-            <w:top w:w="0" w:type="dxa"/>
-            <w:bottom w:w="0" w:type="dxa"/>
-          </w:tblCellMar>
-        </w:tblPrEx>
         <w:tc>
           <w:tcPr>
             <w:tcW w:w="750" w:type="dxa"/>
@@ -22732,12 +21909,6 @@
         </w:tc>
       </w:tr>
       <w:tr>
-        <w:tblPrEx>
-          <w:tblCellMar>
-            <w:top w:w="0" w:type="dxa"/>
-            <w:bottom w:w="0" w:type="dxa"/>
-          </w:tblCellMar>
-        </w:tblPrEx>
         <w:tc>
           <w:tcPr>
             <w:tcW w:w="750" w:type="dxa"/>
@@ -22901,12 +22072,6 @@
         </w:tc>
       </w:tr>
       <w:tr>
-        <w:tblPrEx>
-          <w:tblCellMar>
-            <w:top w:w="0" w:type="dxa"/>
-            <w:bottom w:w="0" w:type="dxa"/>
-          </w:tblCellMar>
-        </w:tblPrEx>
         <w:tc>
           <w:tcPr>
             <w:tcW w:w="750" w:type="dxa"/>
@@ -23070,12 +22235,6 @@
         </w:tc>
       </w:tr>
       <w:tr>
-        <w:tblPrEx>
-          <w:tblCellMar>
-            <w:top w:w="0" w:type="dxa"/>
-            <w:bottom w:w="0" w:type="dxa"/>
-          </w:tblCellMar>
-        </w:tblPrEx>
         <w:tc>
           <w:tcPr>
             <w:tcW w:w="750" w:type="dxa"/>
@@ -23239,12 +22398,6 @@
         </w:tc>
       </w:tr>
       <w:tr>
-        <w:tblPrEx>
-          <w:tblCellMar>
-            <w:top w:w="0" w:type="dxa"/>
-            <w:bottom w:w="0" w:type="dxa"/>
-          </w:tblCellMar>
-        </w:tblPrEx>
         <w:tc>
           <w:tcPr>
             <w:tcW w:w="750" w:type="dxa"/>
@@ -23392,12 +22545,6 @@
         </w:tc>
       </w:tr>
       <w:tr>
-        <w:tblPrEx>
-          <w:tblCellMar>
-            <w:top w:w="0" w:type="dxa"/>
-            <w:bottom w:w="0" w:type="dxa"/>
-          </w:tblCellMar>
-        </w:tblPrEx>
         <w:tc>
           <w:tcPr>
             <w:tcW w:w="750" w:type="dxa"/>
@@ -23545,12 +22692,6 @@
         </w:tc>
       </w:tr>
       <w:tr>
-        <w:tblPrEx>
-          <w:tblCellMar>
-            <w:top w:w="0" w:type="dxa"/>
-            <w:bottom w:w="0" w:type="dxa"/>
-          </w:tblCellMar>
-        </w:tblPrEx>
         <w:tc>
           <w:tcPr>
             <w:tcW w:w="750" w:type="dxa"/>
@@ -23698,12 +22839,6 @@
         </w:tc>
       </w:tr>
       <w:tr>
-        <w:tblPrEx>
-          <w:tblCellMar>
-            <w:top w:w="0" w:type="dxa"/>
-            <w:bottom w:w="0" w:type="dxa"/>
-          </w:tblCellMar>
-        </w:tblPrEx>
         <w:tc>
           <w:tcPr>
             <w:tcW w:w="750" w:type="dxa"/>
@@ -23852,12 +22987,6 @@
         </w:tc>
       </w:tr>
       <w:tr>
-        <w:tblPrEx>
-          <w:tblCellMar>
-            <w:top w:w="0" w:type="dxa"/>
-            <w:bottom w:w="0" w:type="dxa"/>
-          </w:tblCellMar>
-        </w:tblPrEx>
         <w:tc>
           <w:tcPr>
             <w:tcW w:w="750" w:type="dxa"/>
@@ -24005,12 +23134,6 @@
         </w:tc>
       </w:tr>
       <w:tr>
-        <w:tblPrEx>
-          <w:tblCellMar>
-            <w:top w:w="0" w:type="dxa"/>
-            <w:bottom w:w="0" w:type="dxa"/>
-          </w:tblCellMar>
-        </w:tblPrEx>
         <w:tc>
           <w:tcPr>
             <w:tcW w:w="750" w:type="dxa"/>
@@ -24158,12 +23281,6 @@
         </w:tc>
       </w:tr>
       <w:tr>
-        <w:tblPrEx>
-          <w:tblCellMar>
-            <w:top w:w="0" w:type="dxa"/>
-            <w:bottom w:w="0" w:type="dxa"/>
-          </w:tblCellMar>
-        </w:tblPrEx>
         <w:tc>
           <w:tcPr>
             <w:tcW w:w="750" w:type="dxa"/>
@@ -24311,12 +23428,6 @@
         </w:tc>
       </w:tr>
       <w:tr>
-        <w:tblPrEx>
-          <w:tblCellMar>
-            <w:top w:w="0" w:type="dxa"/>
-            <w:bottom w:w="0" w:type="dxa"/>
-          </w:tblCellMar>
-        </w:tblPrEx>
         <w:tc>
           <w:tcPr>
             <w:tcW w:w="750" w:type="dxa"/>
@@ -24464,12 +23575,6 @@
         </w:tc>
       </w:tr>
       <w:tr>
-        <w:tblPrEx>
-          <w:tblCellMar>
-            <w:top w:w="0" w:type="dxa"/>
-            <w:bottom w:w="0" w:type="dxa"/>
-          </w:tblCellMar>
-        </w:tblPrEx>
         <w:tc>
           <w:tcPr>
             <w:tcW w:w="750" w:type="dxa"/>
@@ -24617,12 +23722,6 @@
         </w:tc>
       </w:tr>
       <w:tr>
-        <w:tblPrEx>
-          <w:tblCellMar>
-            <w:top w:w="0" w:type="dxa"/>
-            <w:bottom w:w="0" w:type="dxa"/>
-          </w:tblCellMar>
-        </w:tblPrEx>
         <w:tc>
           <w:tcPr>
             <w:tcW w:w="750" w:type="dxa"/>
@@ -24770,12 +23869,6 @@
         </w:tc>
       </w:tr>
       <w:tr>
-        <w:tblPrEx>
-          <w:tblCellMar>
-            <w:top w:w="0" w:type="dxa"/>
-            <w:bottom w:w="0" w:type="dxa"/>
-          </w:tblCellMar>
-        </w:tblPrEx>
         <w:tc>
           <w:tcPr>
             <w:tcW w:w="750" w:type="dxa"/>
@@ -24923,12 +24016,6 @@
         </w:tc>
       </w:tr>
       <w:tr>
-        <w:tblPrEx>
-          <w:tblCellMar>
-            <w:top w:w="0" w:type="dxa"/>
-            <w:bottom w:w="0" w:type="dxa"/>
-          </w:tblCellMar>
-        </w:tblPrEx>
         <w:tc>
           <w:tcPr>
             <w:tcW w:w="750" w:type="dxa"/>
@@ -25076,12 +24163,6 @@
         </w:tc>
       </w:tr>
       <w:tr>
-        <w:tblPrEx>
-          <w:tblCellMar>
-            <w:top w:w="0" w:type="dxa"/>
-            <w:bottom w:w="0" w:type="dxa"/>
-          </w:tblCellMar>
-        </w:tblPrEx>
         <w:tc>
           <w:tcPr>
             <w:tcW w:w="750" w:type="dxa"/>
@@ -25229,12 +24310,6 @@
         </w:tc>
       </w:tr>
       <w:tr>
-        <w:tblPrEx>
-          <w:tblCellMar>
-            <w:top w:w="0" w:type="dxa"/>
-            <w:bottom w:w="0" w:type="dxa"/>
-          </w:tblCellMar>
-        </w:tblPrEx>
         <w:tc>
           <w:tcPr>
             <w:tcW w:w="750" w:type="dxa"/>
@@ -25382,12 +24457,6 @@
         </w:tc>
       </w:tr>
       <w:tr>
-        <w:tblPrEx>
-          <w:tblCellMar>
-            <w:top w:w="0" w:type="dxa"/>
-            <w:bottom w:w="0" w:type="dxa"/>
-          </w:tblCellMar>
-        </w:tblPrEx>
         <w:tc>
           <w:tcPr>
             <w:tcW w:w="750" w:type="dxa"/>
@@ -25535,12 +24604,6 @@
         </w:tc>
       </w:tr>
       <w:tr>
-        <w:tblPrEx>
-          <w:tblCellMar>
-            <w:top w:w="0" w:type="dxa"/>
-            <w:bottom w:w="0" w:type="dxa"/>
-          </w:tblCellMar>
-        </w:tblPrEx>
         <w:tc>
           <w:tcPr>
             <w:tcW w:w="750" w:type="dxa"/>
@@ -25688,12 +24751,6 @@
         </w:tc>
       </w:tr>
       <w:tr>
-        <w:tblPrEx>
-          <w:tblCellMar>
-            <w:top w:w="0" w:type="dxa"/>
-            <w:bottom w:w="0" w:type="dxa"/>
-          </w:tblCellMar>
-        </w:tblPrEx>
         <w:tc>
           <w:tcPr>
             <w:tcW w:w="750" w:type="dxa"/>
@@ -25841,12 +24898,6 @@
         </w:tc>
       </w:tr>
       <w:tr>
-        <w:tblPrEx>
-          <w:tblCellMar>
-            <w:top w:w="0" w:type="dxa"/>
-            <w:bottom w:w="0" w:type="dxa"/>
-          </w:tblCellMar>
-        </w:tblPrEx>
         <w:tc>
           <w:tcPr>
             <w:tcW w:w="750" w:type="dxa"/>
@@ -26100,12 +25151,6 @@
         <w:gridCol w:w="1460"/>
       </w:tblGrid>
       <w:tr>
-        <w:tblPrEx>
-          <w:tblCellMar>
-            <w:top w:w="0" w:type="dxa"/>
-            <w:bottom w:w="0" w:type="dxa"/>
-          </w:tblCellMar>
-        </w:tblPrEx>
         <w:trPr>
           <w:tblHeader/>
         </w:trPr>
@@ -26271,12 +25316,6 @@
         </w:tc>
       </w:tr>
       <w:tr>
-        <w:tblPrEx>
-          <w:tblCellMar>
-            <w:top w:w="0" w:type="dxa"/>
-            <w:bottom w:w="0" w:type="dxa"/>
-          </w:tblCellMar>
-        </w:tblPrEx>
         <w:tc>
           <w:tcPr>
             <w:tcW w:w="2400" w:type="dxa"/>
@@ -26456,12 +25495,6 @@
         </w:tc>
       </w:tr>
       <w:tr>
-        <w:tblPrEx>
-          <w:tblCellMar>
-            <w:top w:w="0" w:type="dxa"/>
-            <w:bottom w:w="0" w:type="dxa"/>
-          </w:tblCellMar>
-        </w:tblPrEx>
         <w:tc>
           <w:tcPr>
             <w:tcW w:w="2400" w:type="dxa"/>
@@ -26609,12 +25642,6 @@
         </w:tc>
       </w:tr>
       <w:tr>
-        <w:tblPrEx>
-          <w:tblCellMar>
-            <w:top w:w="0" w:type="dxa"/>
-            <w:bottom w:w="0" w:type="dxa"/>
-          </w:tblCellMar>
-        </w:tblPrEx>
         <w:tc>
           <w:tcPr>
             <w:tcW w:w="2400" w:type="dxa"/>
@@ -26778,12 +25805,6 @@
         </w:tc>
       </w:tr>
       <w:tr>
-        <w:tblPrEx>
-          <w:tblCellMar>
-            <w:top w:w="0" w:type="dxa"/>
-            <w:bottom w:w="0" w:type="dxa"/>
-          </w:tblCellMar>
-        </w:tblPrEx>
         <w:tc>
           <w:tcPr>
             <w:tcW w:w="2400" w:type="dxa"/>
@@ -27054,12 +26075,6 @@
         <w:gridCol w:w="1060"/>
       </w:tblGrid>
       <w:tr>
-        <w:tblPrEx>
-          <w:tblCellMar>
-            <w:top w:w="0" w:type="dxa"/>
-            <w:bottom w:w="0" w:type="dxa"/>
-          </w:tblCellMar>
-        </w:tblPrEx>
         <w:trPr>
           <w:tblHeader/>
         </w:trPr>
@@ -27257,12 +26272,6 @@
         </w:tc>
       </w:tr>
       <w:tr>
-        <w:tblPrEx>
-          <w:tblCellMar>
-            <w:top w:w="0" w:type="dxa"/>
-            <w:bottom w:w="0" w:type="dxa"/>
-          </w:tblCellMar>
-        </w:tblPrEx>
         <w:tc>
           <w:tcPr>
             <w:tcW w:w="800" w:type="dxa"/>
@@ -27439,12 +26448,6 @@
         </w:tc>
       </w:tr>
       <w:tr>
-        <w:tblPrEx>
-          <w:tblCellMar>
-            <w:top w:w="0" w:type="dxa"/>
-            <w:bottom w:w="0" w:type="dxa"/>
-          </w:tblCellMar>
-        </w:tblPrEx>
         <w:tc>
           <w:tcPr>
             <w:tcW w:w="800" w:type="dxa"/>
@@ -27621,12 +26624,6 @@
         </w:tc>
       </w:tr>
       <w:tr>
-        <w:tblPrEx>
-          <w:tblCellMar>
-            <w:top w:w="0" w:type="dxa"/>
-            <w:bottom w:w="0" w:type="dxa"/>
-          </w:tblCellMar>
-        </w:tblPrEx>
         <w:tc>
           <w:tcPr>
             <w:tcW w:w="800" w:type="dxa"/>
@@ -27803,12 +26800,6 @@
         </w:tc>
       </w:tr>
       <w:tr>
-        <w:tblPrEx>
-          <w:tblCellMar>
-            <w:top w:w="0" w:type="dxa"/>
-            <w:bottom w:w="0" w:type="dxa"/>
-          </w:tblCellMar>
-        </w:tblPrEx>
         <w:tc>
           <w:tcPr>
             <w:tcW w:w="800" w:type="dxa"/>
@@ -27985,12 +26976,6 @@
         </w:tc>
       </w:tr>
       <w:tr>
-        <w:tblPrEx>
-          <w:tblCellMar>
-            <w:top w:w="0" w:type="dxa"/>
-            <w:bottom w:w="0" w:type="dxa"/>
-          </w:tblCellMar>
-        </w:tblPrEx>
         <w:tc>
           <w:tcPr>
             <w:tcW w:w="800" w:type="dxa"/>
@@ -28167,12 +27152,6 @@
         </w:tc>
       </w:tr>
       <w:tr>
-        <w:tblPrEx>
-          <w:tblCellMar>
-            <w:top w:w="0" w:type="dxa"/>
-            <w:bottom w:w="0" w:type="dxa"/>
-          </w:tblCellMar>
-        </w:tblPrEx>
         <w:tc>
           <w:tcPr>
             <w:tcW w:w="800" w:type="dxa"/>
@@ -28349,12 +27328,6 @@
         </w:tc>
       </w:tr>
       <w:tr>
-        <w:tblPrEx>
-          <w:tblCellMar>
-            <w:top w:w="0" w:type="dxa"/>
-            <w:bottom w:w="0" w:type="dxa"/>
-          </w:tblCellMar>
-        </w:tblPrEx>
         <w:tc>
           <w:tcPr>
             <w:tcW w:w="800" w:type="dxa"/>
@@ -28532,12 +27505,6 @@
         </w:tc>
       </w:tr>
       <w:tr>
-        <w:tblPrEx>
-          <w:tblCellMar>
-            <w:top w:w="0" w:type="dxa"/>
-            <w:bottom w:w="0" w:type="dxa"/>
-          </w:tblCellMar>
-        </w:tblPrEx>
         <w:tc>
           <w:tcPr>
             <w:tcW w:w="800" w:type="dxa"/>
@@ -28714,12 +27681,6 @@
         </w:tc>
       </w:tr>
       <w:tr>
-        <w:tblPrEx>
-          <w:tblCellMar>
-            <w:top w:w="0" w:type="dxa"/>
-            <w:bottom w:w="0" w:type="dxa"/>
-          </w:tblCellMar>
-        </w:tblPrEx>
         <w:tc>
           <w:tcPr>
             <w:tcW w:w="800" w:type="dxa"/>
@@ -28896,12 +27857,6 @@
         </w:tc>
       </w:tr>
       <w:tr>
-        <w:tblPrEx>
-          <w:tblCellMar>
-            <w:top w:w="0" w:type="dxa"/>
-            <w:bottom w:w="0" w:type="dxa"/>
-          </w:tblCellMar>
-        </w:tblPrEx>
         <w:tc>
           <w:tcPr>
             <w:tcW w:w="800" w:type="dxa"/>
@@ -29078,12 +28033,6 @@
         </w:tc>
       </w:tr>
       <w:tr>
-        <w:tblPrEx>
-          <w:tblCellMar>
-            <w:top w:w="0" w:type="dxa"/>
-            <w:bottom w:w="0" w:type="dxa"/>
-          </w:tblCellMar>
-        </w:tblPrEx>
         <w:tc>
           <w:tcPr>
             <w:tcW w:w="800" w:type="dxa"/>
@@ -29260,12 +28209,6 @@
         </w:tc>
       </w:tr>
       <w:tr>
-        <w:tblPrEx>
-          <w:tblCellMar>
-            <w:top w:w="0" w:type="dxa"/>
-            <w:bottom w:w="0" w:type="dxa"/>
-          </w:tblCellMar>
-        </w:tblPrEx>
         <w:tc>
           <w:tcPr>
             <w:tcW w:w="800" w:type="dxa"/>
@@ -29442,12 +28385,6 @@
         </w:tc>
       </w:tr>
       <w:tr>
-        <w:tblPrEx>
-          <w:tblCellMar>
-            <w:top w:w="0" w:type="dxa"/>
-            <w:bottom w:w="0" w:type="dxa"/>
-          </w:tblCellMar>
-        </w:tblPrEx>
         <w:tc>
           <w:tcPr>
             <w:tcW w:w="800" w:type="dxa"/>
@@ -29624,12 +28561,6 @@
         </w:tc>
       </w:tr>
       <w:tr>
-        <w:tblPrEx>
-          <w:tblCellMar>
-            <w:top w:w="0" w:type="dxa"/>
-            <w:bottom w:w="0" w:type="dxa"/>
-          </w:tblCellMar>
-        </w:tblPrEx>
         <w:tc>
           <w:tcPr>
             <w:tcW w:w="800" w:type="dxa"/>
@@ -30533,12 +29464,6 @@
         <w:gridCol w:w="2160"/>
       </w:tblGrid>
       <w:tr>
-        <w:tblPrEx>
-          <w:tblCellMar>
-            <w:top w:w="0" w:type="dxa"/>
-            <w:bottom w:w="0" w:type="dxa"/>
-          </w:tblCellMar>
-        </w:tblPrEx>
         <w:trPr>
           <w:tblHeader/>
         </w:trPr>
@@ -30640,12 +29565,6 @@
         </w:tc>
       </w:tr>
       <w:tr>
-        <w:tblPrEx>
-          <w:tblCellMar>
-            <w:top w:w="0" w:type="dxa"/>
-            <w:bottom w:w="0" w:type="dxa"/>
-          </w:tblCellMar>
-        </w:tblPrEx>
         <w:tc>
           <w:tcPr>
             <w:tcW w:w="2800" w:type="dxa"/>
@@ -30735,12 +29654,6 @@
         </w:tc>
       </w:tr>
       <w:tr>
-        <w:tblPrEx>
-          <w:tblCellMar>
-            <w:top w:w="0" w:type="dxa"/>
-            <w:bottom w:w="0" w:type="dxa"/>
-          </w:tblCellMar>
-        </w:tblPrEx>
         <w:tc>
           <w:tcPr>
             <w:tcW w:w="2800" w:type="dxa"/>
@@ -30830,12 +29743,6 @@
         </w:tc>
       </w:tr>
       <w:tr>
-        <w:tblPrEx>
-          <w:tblCellMar>
-            <w:top w:w="0" w:type="dxa"/>
-            <w:bottom w:w="0" w:type="dxa"/>
-          </w:tblCellMar>
-        </w:tblPrEx>
         <w:tc>
           <w:tcPr>
             <w:tcW w:w="2800" w:type="dxa"/>
@@ -30925,12 +29832,6 @@
         </w:tc>
       </w:tr>
       <w:tr>
-        <w:tblPrEx>
-          <w:tblCellMar>
-            <w:top w:w="0" w:type="dxa"/>
-            <w:bottom w:w="0" w:type="dxa"/>
-          </w:tblCellMar>
-        </w:tblPrEx>
         <w:tc>
           <w:tcPr>
             <w:tcW w:w="2800" w:type="dxa"/>
@@ -31020,12 +29921,6 @@
         </w:tc>
       </w:tr>
       <w:tr>
-        <w:tblPrEx>
-          <w:tblCellMar>
-            <w:top w:w="0" w:type="dxa"/>
-            <w:bottom w:w="0" w:type="dxa"/>
-          </w:tblCellMar>
-        </w:tblPrEx>
         <w:tc>
           <w:tcPr>
             <w:tcW w:w="2800" w:type="dxa"/>
@@ -31115,12 +30010,6 @@
         </w:tc>
       </w:tr>
       <w:tr>
-        <w:tblPrEx>
-          <w:tblCellMar>
-            <w:top w:w="0" w:type="dxa"/>
-            <w:bottom w:w="0" w:type="dxa"/>
-          </w:tblCellMar>
-        </w:tblPrEx>
         <w:tc>
           <w:tcPr>
             <w:tcW w:w="2800" w:type="dxa"/>
@@ -31211,12 +30100,6 @@
         </w:tc>
       </w:tr>
       <w:tr>
-        <w:tblPrEx>
-          <w:tblCellMar>
-            <w:top w:w="0" w:type="dxa"/>
-            <w:bottom w:w="0" w:type="dxa"/>
-          </w:tblCellMar>
-        </w:tblPrEx>
         <w:tc>
           <w:tcPr>
             <w:tcW w:w="2800" w:type="dxa"/>
@@ -31306,12 +30189,6 @@
         </w:tc>
       </w:tr>
       <w:tr>
-        <w:tblPrEx>
-          <w:tblCellMar>
-            <w:top w:w="0" w:type="dxa"/>
-            <w:bottom w:w="0" w:type="dxa"/>
-          </w:tblCellMar>
-        </w:tblPrEx>
         <w:tc>
           <w:tcPr>
             <w:tcW w:w="2800" w:type="dxa"/>
@@ -31401,12 +30278,6 @@
         </w:tc>
       </w:tr>
       <w:tr>
-        <w:tblPrEx>
-          <w:tblCellMar>
-            <w:top w:w="0" w:type="dxa"/>
-            <w:bottom w:w="0" w:type="dxa"/>
-          </w:tblCellMar>
-        </w:tblPrEx>
         <w:tc>
           <w:tcPr>
             <w:tcW w:w="2800" w:type="dxa"/>
@@ -32583,12 +31454,6 @@
         <w:gridCol w:w="4860"/>
       </w:tblGrid>
       <w:tr>
-        <w:tblPrEx>
-          <w:tblCellMar>
-            <w:top w:w="0" w:type="dxa"/>
-            <w:bottom w:w="0" w:type="dxa"/>
-          </w:tblCellMar>
-        </w:tblPrEx>
         <w:trPr>
           <w:tblHeader/>
         </w:trPr>
@@ -32690,12 +31555,6 @@
         </w:tc>
       </w:tr>
       <w:tr>
-        <w:tblPrEx>
-          <w:tblCellMar>
-            <w:top w:w="0" w:type="dxa"/>
-            <w:bottom w:w="0" w:type="dxa"/>
-          </w:tblCellMar>
-        </w:tblPrEx>
         <w:tc>
           <w:tcPr>
             <w:tcW w:w="3000" w:type="dxa"/>
@@ -32785,12 +31644,6 @@
         </w:tc>
       </w:tr>
       <w:tr>
-        <w:tblPrEx>
-          <w:tblCellMar>
-            <w:top w:w="0" w:type="dxa"/>
-            <w:bottom w:w="0" w:type="dxa"/>
-          </w:tblCellMar>
-        </w:tblPrEx>
         <w:tc>
           <w:tcPr>
             <w:tcW w:w="3000" w:type="dxa"/>
@@ -32880,12 +31733,6 @@
         </w:tc>
       </w:tr>
       <w:tr>
-        <w:tblPrEx>
-          <w:tblCellMar>
-            <w:top w:w="0" w:type="dxa"/>
-            <w:bottom w:w="0" w:type="dxa"/>
-          </w:tblCellMar>
-        </w:tblPrEx>
         <w:tc>
           <w:tcPr>
             <w:tcW w:w="3000" w:type="dxa"/>
@@ -32975,12 +31822,6 @@
         </w:tc>
       </w:tr>
       <w:tr>
-        <w:tblPrEx>
-          <w:tblCellMar>
-            <w:top w:w="0" w:type="dxa"/>
-            <w:bottom w:w="0" w:type="dxa"/>
-          </w:tblCellMar>
-        </w:tblPrEx>
         <w:tc>
           <w:tcPr>
             <w:tcW w:w="3000" w:type="dxa"/>
@@ -33070,12 +31911,6 @@
         </w:tc>
       </w:tr>
       <w:tr>
-        <w:tblPrEx>
-          <w:tblCellMar>
-            <w:top w:w="0" w:type="dxa"/>
-            <w:bottom w:w="0" w:type="dxa"/>
-          </w:tblCellMar>
-        </w:tblPrEx>
         <w:tc>
           <w:tcPr>
             <w:tcW w:w="3000" w:type="dxa"/>
@@ -33165,12 +32000,6 @@
         </w:tc>
       </w:tr>
       <w:tr>
-        <w:tblPrEx>
-          <w:tblCellMar>
-            <w:top w:w="0" w:type="dxa"/>
-            <w:bottom w:w="0" w:type="dxa"/>
-          </w:tblCellMar>
-        </w:tblPrEx>
         <w:tc>
           <w:tcPr>
             <w:tcW w:w="3000" w:type="dxa"/>
@@ -33260,12 +32089,6 @@
         </w:tc>
       </w:tr>
       <w:tr>
-        <w:tblPrEx>
-          <w:tblCellMar>
-            <w:top w:w="0" w:type="dxa"/>
-            <w:bottom w:w="0" w:type="dxa"/>
-          </w:tblCellMar>
-        </w:tblPrEx>
         <w:tc>
           <w:tcPr>
             <w:tcW w:w="3000" w:type="dxa"/>
@@ -33732,12 +32555,6 @@
         <w:gridCol w:w="4160"/>
       </w:tblGrid>
       <w:tr>
-        <w:tblPrEx>
-          <w:tblCellMar>
-            <w:top w:w="0" w:type="dxa"/>
-            <w:bottom w:w="0" w:type="dxa"/>
-          </w:tblCellMar>
-        </w:tblPrEx>
         <w:trPr>
           <w:tblHeader/>
         </w:trPr>
@@ -33839,12 +32656,6 @@
         </w:tc>
       </w:tr>
       <w:tr>
-        <w:tblPrEx>
-          <w:tblCellMar>
-            <w:top w:w="0" w:type="dxa"/>
-            <w:bottom w:w="0" w:type="dxa"/>
-          </w:tblCellMar>
-        </w:tblPrEx>
         <w:tc>
           <w:tcPr>
             <w:tcW w:w="3800" w:type="dxa"/>
@@ -33934,12 +32745,6 @@
         </w:tc>
       </w:tr>
       <w:tr>
-        <w:tblPrEx>
-          <w:tblCellMar>
-            <w:top w:w="0" w:type="dxa"/>
-            <w:bottom w:w="0" w:type="dxa"/>
-          </w:tblCellMar>
-        </w:tblPrEx>
         <w:tc>
           <w:tcPr>
             <w:tcW w:w="3800" w:type="dxa"/>
@@ -34029,12 +32834,6 @@
         </w:tc>
       </w:tr>
       <w:tr>
-        <w:tblPrEx>
-          <w:tblCellMar>
-            <w:top w:w="0" w:type="dxa"/>
-            <w:bottom w:w="0" w:type="dxa"/>
-          </w:tblCellMar>
-        </w:tblPrEx>
         <w:tc>
           <w:tcPr>
             <w:tcW w:w="3800" w:type="dxa"/>
@@ -34156,12 +32955,6 @@
         </w:tc>
       </w:tr>
       <w:tr>
-        <w:tblPrEx>
-          <w:tblCellMar>
-            <w:top w:w="0" w:type="dxa"/>
-            <w:bottom w:w="0" w:type="dxa"/>
-          </w:tblCellMar>
-        </w:tblPrEx>
         <w:tc>
           <w:tcPr>
             <w:tcW w:w="3800" w:type="dxa"/>
@@ -34267,12 +33060,6 @@
         </w:tc>
       </w:tr>
       <w:tr>
-        <w:tblPrEx>
-          <w:tblCellMar>
-            <w:top w:w="0" w:type="dxa"/>
-            <w:bottom w:w="0" w:type="dxa"/>
-          </w:tblCellMar>
-        </w:tblPrEx>
         <w:tc>
           <w:tcPr>
             <w:tcW w:w="3800" w:type="dxa"/>
@@ -34379,12 +33166,6 @@
         </w:tc>
       </w:tr>
       <w:tr>
-        <w:tblPrEx>
-          <w:tblCellMar>
-            <w:top w:w="0" w:type="dxa"/>
-            <w:bottom w:w="0" w:type="dxa"/>
-          </w:tblCellMar>
-        </w:tblPrEx>
         <w:tc>
           <w:tcPr>
             <w:tcW w:w="3800" w:type="dxa"/>
@@ -34522,12 +33303,6 @@
         </w:tc>
       </w:tr>
       <w:tr>
-        <w:tblPrEx>
-          <w:tblCellMar>
-            <w:top w:w="0" w:type="dxa"/>
-            <w:bottom w:w="0" w:type="dxa"/>
-          </w:tblCellMar>
-        </w:tblPrEx>
         <w:tc>
           <w:tcPr>
             <w:tcW w:w="3800" w:type="dxa"/>
@@ -34617,12 +33392,6 @@
         </w:tc>
       </w:tr>
       <w:tr>
-        <w:tblPrEx>
-          <w:tblCellMar>
-            <w:top w:w="0" w:type="dxa"/>
-            <w:bottom w:w="0" w:type="dxa"/>
-          </w:tblCellMar>
-        </w:tblPrEx>
         <w:tc>
           <w:tcPr>
             <w:tcW w:w="3800" w:type="dxa"/>
@@ -34712,12 +33481,6 @@
         </w:tc>
       </w:tr>
       <w:tr>
-        <w:tblPrEx>
-          <w:tblCellMar>
-            <w:top w:w="0" w:type="dxa"/>
-            <w:bottom w:w="0" w:type="dxa"/>
-          </w:tblCellMar>
-        </w:tblPrEx>
         <w:tc>
           <w:tcPr>
             <w:tcW w:w="3800" w:type="dxa"/>
@@ -34885,12 +33648,6 @@
         <w:gridCol w:w="2180"/>
       </w:tblGrid>
       <w:tr>
-        <w:tblPrEx>
-          <w:tblCellMar>
-            <w:top w:w="0" w:type="dxa"/>
-            <w:bottom w:w="0" w:type="dxa"/>
-          </w:tblCellMar>
-        </w:tblPrEx>
         <w:trPr>
           <w:tblHeader/>
         </w:trPr>
@@ -34992,12 +33749,6 @@
         </w:tc>
       </w:tr>
       <w:tr>
-        <w:tblPrEx>
-          <w:tblCellMar>
-            <w:top w:w="0" w:type="dxa"/>
-            <w:bottom w:w="0" w:type="dxa"/>
-          </w:tblCellMar>
-        </w:tblPrEx>
         <w:tc>
           <w:tcPr>
             <w:tcW w:w="5000" w:type="dxa"/>
@@ -35087,12 +33838,6 @@
         </w:tc>
       </w:tr>
       <w:tr>
-        <w:tblPrEx>
-          <w:tblCellMar>
-            <w:top w:w="0" w:type="dxa"/>
-            <w:bottom w:w="0" w:type="dxa"/>
-          </w:tblCellMar>
-        </w:tblPrEx>
         <w:tc>
           <w:tcPr>
             <w:tcW w:w="5000" w:type="dxa"/>
@@ -35182,12 +33927,6 @@
         </w:tc>
       </w:tr>
       <w:tr>
-        <w:tblPrEx>
-          <w:tblCellMar>
-            <w:top w:w="0" w:type="dxa"/>
-            <w:bottom w:w="0" w:type="dxa"/>
-          </w:tblCellMar>
-        </w:tblPrEx>
         <w:tc>
           <w:tcPr>
             <w:tcW w:w="5000" w:type="dxa"/>
@@ -35277,12 +34016,6 @@
         </w:tc>
       </w:tr>
       <w:tr>
-        <w:tblPrEx>
-          <w:tblCellMar>
-            <w:top w:w="0" w:type="dxa"/>
-            <w:bottom w:w="0" w:type="dxa"/>
-          </w:tblCellMar>
-        </w:tblPrEx>
         <w:tc>
           <w:tcPr>
             <w:tcW w:w="5000" w:type="dxa"/>
@@ -35372,12 +34105,6 @@
         </w:tc>
       </w:tr>
       <w:tr>
-        <w:tblPrEx>
-          <w:tblCellMar>
-            <w:top w:w="0" w:type="dxa"/>
-            <w:bottom w:w="0" w:type="dxa"/>
-          </w:tblCellMar>
-        </w:tblPrEx>
         <w:tc>
           <w:tcPr>
             <w:tcW w:w="5000" w:type="dxa"/>
@@ -35467,12 +34194,6 @@
         </w:tc>
       </w:tr>
       <w:tr>
-        <w:tblPrEx>
-          <w:tblCellMar>
-            <w:top w:w="0" w:type="dxa"/>
-            <w:bottom w:w="0" w:type="dxa"/>
-          </w:tblCellMar>
-        </w:tblPrEx>
         <w:tc>
           <w:tcPr>
             <w:tcW w:w="5000" w:type="dxa"/>
@@ -35562,12 +34283,6 @@
         </w:tc>
       </w:tr>
       <w:tr>
-        <w:tblPrEx>
-          <w:tblCellMar>
-            <w:top w:w="0" w:type="dxa"/>
-            <w:bottom w:w="0" w:type="dxa"/>
-          </w:tblCellMar>
-        </w:tblPrEx>
         <w:tc>
           <w:tcPr>
             <w:tcW w:w="5000" w:type="dxa"/>
@@ -35737,12 +34452,6 @@
         <w:gridCol w:w="1560"/>
       </w:tblGrid>
       <w:tr>
-        <w:tblPrEx>
-          <w:tblCellMar>
-            <w:top w:w="0" w:type="dxa"/>
-            <w:bottom w:w="0" w:type="dxa"/>
-          </w:tblCellMar>
-        </w:tblPrEx>
         <w:trPr>
           <w:tblHeader/>
         </w:trPr>
@@ -35908,12 +34617,6 @@
         </w:tc>
       </w:tr>
       <w:tr>
-        <w:tblPrEx>
-          <w:tblCellMar>
-            <w:top w:w="0" w:type="dxa"/>
-            <w:bottom w:w="0" w:type="dxa"/>
-          </w:tblCellMar>
-        </w:tblPrEx>
         <w:tc>
           <w:tcPr>
             <w:tcW w:w="1200" w:type="dxa"/>
@@ -36061,12 +34764,6 @@
         </w:tc>
       </w:tr>
       <w:tr>
-        <w:tblPrEx>
-          <w:tblCellMar>
-            <w:top w:w="0" w:type="dxa"/>
-            <w:bottom w:w="0" w:type="dxa"/>
-          </w:tblCellMar>
-        </w:tblPrEx>
         <w:tc>
           <w:tcPr>
             <w:tcW w:w="1200" w:type="dxa"/>
@@ -36223,12 +34920,6 @@
         </w:tc>
       </w:tr>
       <w:tr>
-        <w:tblPrEx>
-          <w:tblCellMar>
-            <w:top w:w="0" w:type="dxa"/>
-            <w:bottom w:w="0" w:type="dxa"/>
-          </w:tblCellMar>
-        </w:tblPrEx>
         <w:tc>
           <w:tcPr>
             <w:tcW w:w="1200" w:type="dxa"/>
@@ -36395,12 +35086,6 @@
         </w:tc>
       </w:tr>
       <w:tr>
-        <w:tblPrEx>
-          <w:tblCellMar>
-            <w:top w:w="0" w:type="dxa"/>
-            <w:bottom w:w="0" w:type="dxa"/>
-          </w:tblCellMar>
-        </w:tblPrEx>
         <w:tc>
           <w:tcPr>
             <w:tcW w:w="1200" w:type="dxa"/>
@@ -36557,12 +35242,6 @@
         </w:tc>
       </w:tr>
       <w:tr>
-        <w:tblPrEx>
-          <w:tblCellMar>
-            <w:top w:w="0" w:type="dxa"/>
-            <w:bottom w:w="0" w:type="dxa"/>
-          </w:tblCellMar>
-        </w:tblPrEx>
         <w:tc>
           <w:tcPr>
             <w:tcW w:w="1200" w:type="dxa"/>
@@ -36719,12 +35398,6 @@
         </w:tc>
       </w:tr>
       <w:tr>
-        <w:tblPrEx>
-          <w:tblCellMar>
-            <w:top w:w="0" w:type="dxa"/>
-            <w:bottom w:w="0" w:type="dxa"/>
-          </w:tblCellMar>
-        </w:tblPrEx>
         <w:tc>
           <w:tcPr>
             <w:tcW w:w="1200" w:type="dxa"/>

</xml_diff>

<commit_message>
Documento final con capturas del rediseño
</commit_message>
<xml_diff>
--- a/docs/Proyecto_de_Aula_LF_Final.docx
+++ b/docs/Proyecto_de_Aula_LF_Final.docx
@@ -15165,7 +15165,7 @@
         <w:jc w:val="both"/>
       </w:pPr>
       <w:r>
-        <w:t>La interfaz se diseñó para un computador de escritorio en el mostrador de objetos perdidos, con colores azul y blanco y sin vínculo visual con la marca de la universidad. Las decisiones de diseño, acordadas por el equipo, fueron:</w:t>
+        <w:t>La interfaz se diseñó para un computador de escritorio en el mostrador de objetos perdidos, con un estilo de degradados en azul, morado y rosa, tarjetas con efecto de relieve y el nombre visible LostAndFound, sin vínculo visual con la marca de la universidad. El rediseño visual final lo hizo Javier Carta sobre la interfaz construida en la Fase 4, sin cambiar su funcionamiento. Las decisiones de diseño, acordadas por el equipo, fueron:</w:t>
       </w:r>
     </w:p>
     <w:p>
@@ -15320,7 +15320,7 @@
         </w:rPr>
         <w:drawing>
           <wp:inline distT="0" distB="0" distL="0" distR="0" wp14:anchorId="149E7205" wp14:editId="1D88E4DD">
-            <wp:extent cx="5305425" cy="2581275"/>
+            <wp:extent cx="5305425" cy="3730376"/>
             <wp:effectExtent l="0" t="0" r="0" b="0"/>
             <wp:docPr id="210298918" name="login_error.png" descr="Pantalla de inicio de sesión con error en la misma pantalla" title="Pantalla de inicio de sesión con error en la misma pantalla"/>
             <wp:cNvGraphicFramePr>
@@ -15345,7 +15345,7 @@
                   <pic:spPr bwMode="auto">
                     <a:xfrm>
                       <a:off x="0" y="0"/>
-                      <a:ext cx="5305425" cy="2581275"/>
+                      <a:ext cx="5305425" cy="3730376"/>
                     </a:xfrm>
                     <a:prstGeom prst="rect">
                       <a:avLst/>
@@ -15416,7 +15416,7 @@
         </w:rPr>
         <w:drawing>
           <wp:inline distT="0" distB="0" distL="0" distR="0" wp14:anchorId="27C0AADC" wp14:editId="256772B8">
-            <wp:extent cx="5305425" cy="2190750"/>
+            <wp:extent cx="5305425" cy="3257862"/>
             <wp:effectExtent l="0" t="0" r="0" b="0"/>
             <wp:docPr id="1551376080" name="mostrador.png" descr="Mostrador: tres opciones y resumen de pendientes" title="Mostrador: tres opciones y resumen de pendientes"/>
             <wp:cNvGraphicFramePr>
@@ -15441,7 +15441,7 @@
                   <pic:spPr bwMode="auto">
                     <a:xfrm>
                       <a:off x="0" y="0"/>
-                      <a:ext cx="5305425" cy="2190750"/>
+                      <a:ext cx="5305425" cy="3257862"/>
                     </a:xfrm>
                     <a:prstGeom prst="rect">
                       <a:avLst/>
@@ -20326,7 +20326,7 @@
                 <w:sz w:val="19"/>
                 <w:szCs w:val="19"/>
               </w:rPr>
-              <w:t xml:space="preserve">Mejora del guardado de fotos, </w:t>
+              <w:t xml:space="preserve">Mejora del guardado de fotos, rediseño visual de la interfaz, </w:t>
             </w:r>
             <w:proofErr w:type="spellStart"/>
             <w:r>
@@ -30467,7 +30467,7 @@
         </w:rPr>
         <w:drawing>
           <wp:inline distT="0" distB="0" distL="0" distR="0" wp14:anchorId="0CA8CA8C" wp14:editId="426F1E32">
-            <wp:extent cx="5305425" cy="3438525"/>
+            <wp:extent cx="5305425" cy="3838143"/>
             <wp:effectExtent l="0" t="0" r="0" b="0"/>
             <wp:docPr id="1667394527" name="entregar_3.png" descr="Registro de un objeto encontrado y reportes de pérdida que coinciden (RF04, RF28)" title="Registro de un objeto encontrado y reportes de pérdida que coinciden (RF04, RF28)"/>
             <wp:cNvGraphicFramePr>
@@ -30492,7 +30492,7 @@
                   <pic:spPr bwMode="auto">
                     <a:xfrm>
                       <a:off x="0" y="0"/>
-                      <a:ext cx="5305425" cy="3438525"/>
+                      <a:ext cx="5305425" cy="3838143"/>
                     </a:xfrm>
                     <a:prstGeom prst="rect">
                       <a:avLst/>
@@ -30564,7 +30564,7 @@
         </w:rPr>
         <w:drawing>
           <wp:inline distT="0" distB="0" distL="0" distR="0" wp14:anchorId="3BE64CFD" wp14:editId="0D24642C">
-            <wp:extent cx="5305425" cy="3676650"/>
+            <wp:extent cx="5305425" cy="4003937"/>
             <wp:effectExtent l="0" t="0" r="0" b="0"/>
             <wp:docPr id="484861573" name="perdida_3.png" descr="Reporte de pérdida con su vencimiento y objetos encontrados que coinciden (RF03, RF05, RF29)" title="Reporte de pérdida con su vencimiento y objetos encontrados que coinciden (RF03, RF05, RF29)"/>
             <wp:cNvGraphicFramePr>
@@ -30589,7 +30589,7 @@
                   <pic:spPr bwMode="auto">
                     <a:xfrm>
                       <a:off x="0" y="0"/>
-                      <a:ext cx="5305425" cy="3676650"/>
+                      <a:ext cx="5305425" cy="4003937"/>
                     </a:xfrm>
                     <a:prstGeom prst="rect">
                       <a:avLst/>
@@ -30660,7 +30660,7 @@
         </w:rPr>
         <w:drawing>
           <wp:inline distT="0" distB="0" distL="0" distR="0" wp14:anchorId="4823B2CB" wp14:editId="1C8EE22D">
-            <wp:extent cx="5305425" cy="2790825"/>
+            <wp:extent cx="5305425" cy="3224703"/>
             <wp:effectExtent l="0" t="0" r="0" b="0"/>
             <wp:docPr id="646128235" name="reclamar_1_alerta.png" descr="Paso 1 de una reclamación: persona con alerta de intentos fallidos (RF24)" title="Paso 1 de una reclamación: persona con alerta de intentos fallidos (RF24)"/>
             <wp:cNvGraphicFramePr>
@@ -30685,7 +30685,7 @@
                   <pic:spPr bwMode="auto">
                     <a:xfrm>
                       <a:off x="0" y="0"/>
-                      <a:ext cx="5305425" cy="2790825"/>
+                      <a:ext cx="5305425" cy="3224703"/>
                     </a:xfrm>
                     <a:prstGeom prst="rect">
                       <a:avLst/>
@@ -30757,7 +30757,7 @@
         </w:rPr>
         <w:drawing>
           <wp:inline distT="0" distB="0" distL="0" distR="0" wp14:anchorId="30879651" wp14:editId="5C9E5D38">
-            <wp:extent cx="5305425" cy="3981450"/>
+            <wp:extent cx="5305425" cy="4265064"/>
             <wp:effectExtent l="0" t="0" r="0" b="0"/>
             <wp:docPr id="1888885316" name="reclamar_4.png" descr="Paso 4: comparación lado a lado entre la descripción y lo registrado del objeto (RF09)" title="Paso 4: comparación lado a lado entre la descripción y lo registrado del objeto (RF09)"/>
             <wp:cNvGraphicFramePr>
@@ -30782,7 +30782,7 @@
                   <pic:spPr bwMode="auto">
                     <a:xfrm>
                       <a:off x="0" y="0"/>
-                      <a:ext cx="5305425" cy="3981450"/>
+                      <a:ext cx="5305425" cy="4265064"/>
                     </a:xfrm>
                     <a:prstGeom prst="rect">
                       <a:avLst/>
@@ -30854,7 +30854,7 @@
         </w:rPr>
         <w:drawing>
           <wp:inline distT="0" distB="0" distL="0" distR="0" wp14:anchorId="426B053C" wp14:editId="1EB4AB1C">
-            <wp:extent cx="4505325" cy="6762750"/>
+            <wp:extent cx="4505325" cy="6687591"/>
             <wp:effectExtent l="0" t="0" r="0" b="0"/>
             <wp:docPr id="234994618" name="reclamar_4_previa.png" descr="Comparación de un objeto ya entregado: entrega previa, incidente y aprobación bloqueada (RF23, RF26)" title="Comparación de un objeto ya entregado: entrega previa, incidente y aprobación bloqueada (RF23, RF26)"/>
             <wp:cNvGraphicFramePr>
@@ -30879,7 +30879,7 @@
                   <pic:spPr bwMode="auto">
                     <a:xfrm>
                       <a:off x="0" y="0"/>
-                      <a:ext cx="4505325" cy="6762750"/>
+                      <a:ext cx="4505325" cy="6687591"/>
                     </a:xfrm>
                     <a:prstGeom prst="rect">
                       <a:avLst/>
@@ -30951,7 +30951,7 @@
         </w:rPr>
         <w:drawing>
           <wp:inline distT="0" distB="0" distL="0" distR="0" wp14:anchorId="1415229F" wp14:editId="09DDF240">
-            <wp:extent cx="5124450" cy="4305300"/>
+            <wp:extent cx="5124450" cy="4499907"/>
             <wp:effectExtent l="0" t="0" r="0" b="0"/>
             <wp:docPr id="1299452722" name="reclamar_5.png" descr="Paso 5: entrega con foto obligatoria tras la aprobación (RF15, RF22)" title="Paso 5: entrega con foto obligatoria tras la aprobación (RF15, RF22)"/>
             <wp:cNvGraphicFramePr>
@@ -30976,7 +30976,7 @@
                   <pic:spPr bwMode="auto">
                     <a:xfrm>
                       <a:off x="0" y="0"/>
-                      <a:ext cx="5124450" cy="4305300"/>
+                      <a:ext cx="5124450" cy="4499907"/>
                     </a:xfrm>
                     <a:prstGeom prst="rect">
                       <a:avLst/>
@@ -31048,7 +31048,7 @@
         </w:rPr>
         <w:drawing>
           <wp:inline distT="0" distB="0" distL="0" distR="0" wp14:anchorId="22A3357A" wp14:editId="6A4753F2">
-            <wp:extent cx="5124450" cy="4248150"/>
+            <wp:extent cx="5124450" cy="4435852"/>
             <wp:effectExtent l="0" t="0" r="0" b="0"/>
             <wp:docPr id="607437779" name="objeto_entregado.png" descr="Detalle de un objeto entregado con su entrega y su reclamación (RF16–RF18)" title="Detalle de un objeto entregado con su entrega y su reclamación (RF16–RF18)"/>
             <wp:cNvGraphicFramePr>
@@ -31073,7 +31073,7 @@
                   <pic:spPr bwMode="auto">
                     <a:xfrm>
                       <a:off x="0" y="0"/>
-                      <a:ext cx="5124450" cy="4248150"/>
+                      <a:ext cx="5124450" cy="4435852"/>
                     </a:xfrm>
                     <a:prstGeom prst="rect">
                       <a:avLst/>
@@ -31144,7 +31144,7 @@
         </w:rPr>
         <w:drawing>
           <wp:inline distT="0" distB="0" distL="0" distR="0" wp14:anchorId="4D6C67D2" wp14:editId="52D7B543">
-            <wp:extent cx="5305425" cy="2505075"/>
+            <wp:extent cx="5305425" cy="3166675"/>
             <wp:effectExtent l="0" t="0" r="0" b="0"/>
             <wp:docPr id="776887811" name="pendientes.png" descr="Pendientes: reclamaciones por decidir y por entregar (RF08)" title="Pendientes: reclamaciones por decidir y por entregar (RF08)"/>
             <wp:cNvGraphicFramePr>
@@ -31169,7 +31169,7 @@
                   <pic:spPr bwMode="auto">
                     <a:xfrm>
                       <a:off x="0" y="0"/>
-                      <a:ext cx="5305425" cy="2505075"/>
+                      <a:ext cx="5305425" cy="3166675"/>
                     </a:xfrm>
                     <a:prstGeom prst="rect">
                       <a:avLst/>
@@ -31241,7 +31241,7 @@
         </w:rPr>
         <w:drawing>
           <wp:inline distT="0" distB="0" distL="0" distR="0" wp14:anchorId="38519A3D" wp14:editId="2D96FA44">
-            <wp:extent cx="5305425" cy="2743200"/>
+            <wp:extent cx="5305425" cy="2959432"/>
             <wp:effectExtent l="0" t="0" r="0" b="0"/>
             <wp:docPr id="331141231" name="historial_entregas.png" descr="Historial de entregas con foto de evidencia e incidentes (RF18, RF23)" title="Historial de entregas con foto de evidencia e incidentes (RF18, RF23)"/>
             <wp:cNvGraphicFramePr>
@@ -31266,7 +31266,7 @@
                   <pic:spPr bwMode="auto">
                     <a:xfrm>
                       <a:off x="0" y="0"/>
-                      <a:ext cx="5305425" cy="2743200"/>
+                      <a:ext cx="5305425" cy="2959432"/>
                     </a:xfrm>
                     <a:prstGeom prst="rect">
                       <a:avLst/>
@@ -31337,7 +31337,7 @@
         </w:rPr>
         <w:drawing>
           <wp:inline distT="0" distB="0" distL="0" distR="0" wp14:anchorId="140BCFF5" wp14:editId="2435A7E6">
-            <wp:extent cx="5305425" cy="3362325"/>
+            <wp:extent cx="5305425" cy="3502409"/>
             <wp:effectExtent l="0" t="0" r="0" b="0"/>
             <wp:docPr id="1222695526" name="alertas.png" descr="Personas con alerta de intentos fallidos y motivo de cada rechazo (RF24)" title="Personas con alerta de intentos fallidos y motivo de cada rechazo (RF24)"/>
             <wp:cNvGraphicFramePr>
@@ -31362,7 +31362,7 @@
                   <pic:spPr bwMode="auto">
                     <a:xfrm>
                       <a:off x="0" y="0"/>
-                      <a:ext cx="5305425" cy="3362325"/>
+                      <a:ext cx="5305425" cy="3502409"/>
                     </a:xfrm>
                     <a:prstGeom prst="rect">
                       <a:avLst/>

</xml_diff>